<commit_message>
updated graphs homework sheet
</commit_message>
<xml_diff>
--- a/Homework/CSC349 Homework 2 Graphs.docx
+++ b/Homework/CSC349 Homework 2 Graphs.docx
@@ -1,6 +1,6 @@
 
 <file path=word/document.xml><?xml version="1.0" encoding="utf-8"?>
-<w:document xmlns:wpc="http://schemas.microsoft.com/office/word/2010/wordprocessingCanvas" xmlns:cx="http://schemas.microsoft.com/office/drawing/2014/chartex" xmlns:cx1="http://schemas.microsoft.com/office/drawing/2015/9/8/chartex" xmlns:cx2="http://schemas.microsoft.com/office/drawing/2015/10/21/chartex" xmlns:cx3="http://schemas.microsoft.com/office/drawing/2016/5/9/chartex" xmlns:cx4="http://schemas.microsoft.com/office/drawing/2016/5/10/chartex" xmlns:cx5="http://schemas.microsoft.com/office/drawing/2016/5/11/chartex" xmlns:cx6="http://schemas.microsoft.com/office/drawing/2016/5/12/chartex" xmlns:cx7="http://schemas.microsoft.com/office/drawing/2016/5/13/chartex" xmlns:cx8="http://schemas.microsoft.com/office/drawing/2016/5/14/chartex" xmlns:mc="http://schemas.openxmlformats.org/markup-compatibility/2006" xmlns:aink="http://schemas.microsoft.com/office/drawing/2016/ink" xmlns:am3d="http://schemas.microsoft.com/office/drawing/2017/model3d" xmlns:o="urn:schemas-microsoft-com:office:office" xmlns:oel="http://schemas.microsoft.com/office/2019/extlst" xmlns:r="http://schemas.openxmlformats.org/officeDocument/2006/relationships" xmlns:m="http://schemas.openxmlformats.org/officeDocument/2006/math" xmlns:v="urn:schemas-microsoft-com:vml" xmlns:wp14="http://schemas.microsoft.com/office/word/2010/wordprocessingDrawing" xmlns:wp="http://schemas.openxmlformats.org/drawingml/2006/wordprocessingDrawing" xmlns:w10="urn:schemas-microsoft-com:office:word" xmlns:w="http://schemas.openxmlformats.org/wordprocessingml/2006/main" xmlns:w14="http://schemas.microsoft.com/office/word/2010/wordml" xmlns:w15="http://schemas.microsoft.com/office/word/2012/wordml" xmlns:w16cex="http://schemas.microsoft.com/office/word/2018/wordml/cex" xmlns:w16cid="http://schemas.microsoft.com/office/word/2016/wordml/cid" xmlns:w16="http://schemas.microsoft.com/office/word/2018/wordml" xmlns:w16du="http://schemas.microsoft.com/office/word/2023/wordml/word16du" xmlns:w16sdtdh="http://schemas.microsoft.com/office/word/2020/wordml/sdtdatahash" xmlns:w16sdtfl="http://schemas.microsoft.com/office/word/2024/wordml/sdtformatlock" xmlns:w16se="http://schemas.microsoft.com/office/word/2015/wordml/symex" xmlns:wpg="http://schemas.microsoft.com/office/word/2010/wordprocessingGroup" xmlns:wpi="http://schemas.microsoft.com/office/word/2010/wordprocessingInk" xmlns:wne="http://schemas.microsoft.com/office/word/2006/wordml" xmlns:wps="http://schemas.microsoft.com/office/word/2010/wordprocessingShape" mc:Ignorable="w14 w15 w16se w16cid w16 w16cex w16sdtdh w16sdtfl w16du wp14">
+<w:document xmlns:wpc="http://schemas.microsoft.com/office/word/2010/wordprocessingCanvas" xmlns:cx="http://schemas.microsoft.com/office/drawing/2014/chartex" xmlns:cx1="http://schemas.microsoft.com/office/drawing/2015/9/8/chartex" xmlns:cx2="http://schemas.microsoft.com/office/drawing/2015/10/21/chartex" xmlns:cx3="http://schemas.microsoft.com/office/drawing/2016/5/9/chartex" xmlns:cx4="http://schemas.microsoft.com/office/drawing/2016/5/10/chartex" xmlns:cx5="http://schemas.microsoft.com/office/drawing/2016/5/11/chartex" xmlns:cx6="http://schemas.microsoft.com/office/drawing/2016/5/12/chartex" xmlns:cx7="http://schemas.microsoft.com/office/drawing/2016/5/13/chartex" xmlns:cx8="http://schemas.microsoft.com/office/drawing/2016/5/14/chartex" xmlns:mc="http://schemas.openxmlformats.org/markup-compatibility/2006" xmlns:m="http://schemas.openxmlformats.org/officeDocument/2006/math" xmlns:aink="http://schemas.microsoft.com/office/drawing/2016/ink" xmlns:am3d="http://schemas.microsoft.com/office/drawing/2017/model3d" xmlns:oel="http://schemas.microsoft.com/office/2019/extlst" xmlns:r="http://schemas.openxmlformats.org/officeDocument/2006/relationships" xmlns:wp14="http://schemas.microsoft.com/office/word/2010/wordprocessingDrawing" xmlns:wp="http://schemas.openxmlformats.org/drawingml/2006/wordprocessingDrawing" xmlns:wpg="http://schemas.microsoft.com/office/word/2010/wordprocessingGroup" xmlns:wpi="http://schemas.microsoft.com/office/word/2010/wordprocessingInk" xmlns:wps="http://schemas.microsoft.com/office/word/2010/wordprocessingShape" xmlns:o="urn:schemas-microsoft-com:office:office" xmlns:v="urn:schemas-microsoft-com:vml" xmlns:w10="urn:schemas-microsoft-com:office:word" xmlns:w="http://schemas.openxmlformats.org/wordprocessingml/2006/main" xmlns:w14="http://schemas.microsoft.com/office/word/2010/wordml" xmlns:w15="http://schemas.microsoft.com/office/word/2012/wordml" xmlns:w16cex="http://schemas.microsoft.com/office/word/2018/wordml/cex" xmlns:w16cid="http://schemas.microsoft.com/office/word/2016/wordml/cid" xmlns:w16="http://schemas.microsoft.com/office/word/2018/wordml" xmlns:w16sdtdh="http://schemas.microsoft.com/office/word/2020/wordml/sdtdatahash" xmlns:w16sdtfl="http://schemas.microsoft.com/office/word/2024/wordml/sdtformatlock" xmlns:w16se="http://schemas.microsoft.com/office/word/2015/wordml/symex" xmlns:w16du="http://schemas.microsoft.com/office/word/2023/wordml/word16du" xmlns:wne="http://schemas.microsoft.com/office/word/2006/wordml" mc:Ignorable="w14 w15 w16se w16cid w16 w16cex w16sdtdh w16sdtfl w16du wp14">
   <w:body>
     <w:p>
       <w:pPr>
@@ -97,6 +97,189 @@
         </w:numPr>
       </w:pPr>
       <w:r>
+        <w:t>State the time complexity of the following operations if using either an adjacency matrix or adjacency list (with a linked list) as your graph representation, in terms of the number of vertices in the graph (n), the number of edges (m) and the number of neighbors of the queried vertex (deg(v))</w:t>
+      </w:r>
+    </w:p>
+    <w:p>
+      <w:pPr>
+        <w:pStyle w:val="Heading3"/>
+        <w:numPr>
+          <w:ilvl w:val="1"/>
+          <w:numId w:val="3"/>
+        </w:numPr>
+      </w:pPr>
+      <w:r>
+        <w:t>Check whether u and v are neighbors</w:t>
+      </w:r>
+    </w:p>
+    <w:p>
+      <w:pPr>
+        <w:pStyle w:val="Heading3"/>
+        <w:numPr>
+          <w:ilvl w:val="1"/>
+          <w:numId w:val="3"/>
+        </w:numPr>
+      </w:pPr>
+      <w:r>
+        <w:t>List all neighbors of v</w:t>
+      </w:r>
+    </w:p>
+    <w:p>
+      <w:pPr>
+        <w:pStyle w:val="Heading3"/>
+        <w:numPr>
+          <w:ilvl w:val="0"/>
+          <w:numId w:val="3"/>
+        </w:numPr>
+      </w:pPr>
+      <w:r>
+        <w:t>State the space complexity of both the adjacency matrix and adjacency list representations</w:t>
+      </w:r>
+    </w:p>
+    <w:p>
+      <w:pPr>
+        <w:pStyle w:val="Heading3"/>
+        <w:numPr>
+          <w:ilvl w:val="0"/>
+          <w:numId w:val="3"/>
+        </w:numPr>
+      </w:pPr>
+      <w:r>
+        <w:t>Extend the DFS-Explore(</w:t>
+      </w:r>
+      <w:proofErr w:type="spellStart"/>
+      <w:proofErr w:type="gramStart"/>
+      <w:r>
+        <w:t>G,v</w:t>
+      </w:r>
+      <w:proofErr w:type="spellEnd"/>
+      <w:proofErr w:type="gramEnd"/>
+      <w:r>
+        <w:t>) and DFS(G) algorithms so th</w:t>
+      </w:r>
+      <w:r>
+        <w:t>at, after running DFS(G) on an undirected graph, the following queries are supported</w:t>
+      </w:r>
+      <w:r>
+        <w:t>:</w:t>
+      </w:r>
+    </w:p>
+    <w:p>
+      <w:pPr>
+        <w:pStyle w:val="Heading3"/>
+        <w:numPr>
+          <w:ilvl w:val="1"/>
+          <w:numId w:val="3"/>
+        </w:numPr>
+      </w:pPr>
+      <w:r>
+        <w:t>Identifying which vertices acted as root for the individual DFS-Explore calls</w:t>
+      </w:r>
+    </w:p>
+    <w:p>
+      <w:pPr>
+        <w:pStyle w:val="Heading3"/>
+        <w:numPr>
+          <w:ilvl w:val="1"/>
+          <w:numId w:val="3"/>
+        </w:numPr>
+      </w:pPr>
+      <w:r>
+        <w:t>Identifying who the parent of a given vertex is on the search tree</w:t>
+      </w:r>
+    </w:p>
+    <w:p>
+      <w:pPr>
+        <w:pStyle w:val="Heading3"/>
+        <w:numPr>
+          <w:ilvl w:val="1"/>
+          <w:numId w:val="3"/>
+        </w:numPr>
+      </w:pPr>
+      <w:r>
+        <w:t xml:space="preserve">Printing the path, along the search tree, from a given vertex to the root of its search tree </w:t>
+      </w:r>
+    </w:p>
+    <w:p>
+      <w:pPr>
+        <w:pStyle w:val="Heading3"/>
+        <w:numPr>
+          <w:ilvl w:val="1"/>
+          <w:numId w:val="3"/>
+        </w:numPr>
+      </w:pPr>
+      <w:r>
+        <w:t>Querying the</w:t>
+      </w:r>
+      <w:r>
+        <w:t xml:space="preserve"> pre- and post-visit number of each vertex</w:t>
+      </w:r>
+    </w:p>
+    <w:p>
+      <w:pPr>
+        <w:pStyle w:val="Heading3"/>
+        <w:numPr>
+          <w:ilvl w:val="1"/>
+          <w:numId w:val="3"/>
+        </w:numPr>
+      </w:pPr>
+      <w:r>
+        <w:t>Querying the type of any given edge (</w:t>
+      </w:r>
+      <w:proofErr w:type="spellStart"/>
+      <w:proofErr w:type="gramStart"/>
+      <w:r>
+        <w:t>u,v</w:t>
+      </w:r>
+      <w:proofErr w:type="spellEnd"/>
+      <w:proofErr w:type="gramEnd"/>
+      <w:r>
+        <w:t>)</w:t>
+      </w:r>
+    </w:p>
+    <w:p>
+      <w:pPr>
+        <w:pStyle w:val="Heading3"/>
+        <w:numPr>
+          <w:ilvl w:val="1"/>
+          <w:numId w:val="3"/>
+        </w:numPr>
+      </w:pPr>
+      <w:r>
+        <w:t>Given a back edge (</w:t>
+      </w:r>
+      <w:proofErr w:type="spellStart"/>
+      <w:proofErr w:type="gramStart"/>
+      <w:r>
+        <w:t>u,v</w:t>
+      </w:r>
+      <w:proofErr w:type="spellEnd"/>
+      <w:proofErr w:type="gramEnd"/>
+      <w:r>
+        <w:t>), print the corresponding loop</w:t>
+      </w:r>
+    </w:p>
+    <w:p>
+      <w:pPr>
+        <w:pStyle w:val="Heading3"/>
+        <w:numPr>
+          <w:ilvl w:val="1"/>
+          <w:numId w:val="3"/>
+        </w:numPr>
+      </w:pPr>
+      <w:r>
+        <w:t>Assigning a number to each new connected component, and querying for the component of a given vertex</w:t>
+      </w:r>
+    </w:p>
+    <w:p>
+      <w:pPr>
+        <w:pStyle w:val="Heading3"/>
+        <w:numPr>
+          <w:ilvl w:val="0"/>
+          <w:numId w:val="3"/>
+        </w:numPr>
+      </w:pPr>
+      <w:r>
         <w:t xml:space="preserve">Perform the DFS algorithm on the following graph. Give the pre- and </w:t>
       </w:r>
       <w:r>
@@ -134,6 +317,7 @@
         <w:rPr>
           <w:noProof/>
         </w:rPr>
+        <w:lastRenderedPageBreak/>
         <w:drawing>
           <wp:inline distT="0" distB="0" distL="0" distR="0" wp14:anchorId="136D5927" wp14:editId="64FEFB68">
             <wp:extent cx="3619500" cy="1990966"/>
@@ -379,7 +563,6 @@
         <w:spacing w:before="60" w:after="80"/>
       </w:pPr>
       <w:r>
-        <w:lastRenderedPageBreak/>
         <w:t>Define the graph</w:t>
       </w:r>
       <w:r>
@@ -463,14 +646,7 @@
           <w:i/>
           <w:iCs/>
         </w:rPr>
-        <w:t>Post order</w:t>
-      </w:r>
-      <w:r>
-        <w:rPr>
-          <w:i/>
-          <w:iCs/>
-        </w:rPr>
-        <w:t>:</w:t>
+        <w:t>Post order:</w:t>
       </w:r>
       <w:r>
         <w:t xml:space="preserve">  D, L, M, H, I, E, F, B, J, N, K, G, C, A</w:t>
@@ -538,6 +714,7 @@
         <w:pStyle w:val="Heading3"/>
       </w:pPr>
       <w:r>
+        <w:lastRenderedPageBreak/>
         <w:t xml:space="preserve">7. Prove that in an undirected graph, </w:t>
       </w:r>
       <w:proofErr w:type="spellStart"/>
@@ -711,192 +888,195 @@
         <w:spacing w:before="60" w:after="80"/>
       </w:pPr>
       <w:r>
+        <w:t>Does the same hold true for directed graphs (and strongly connected components rather than connected components)? (Proof or counterexample)</w:t>
+      </w:r>
+    </w:p>
+    <w:p>
+      <w:pPr>
+        <w:pStyle w:val="Heading3"/>
+      </w:pPr>
+      <w:r>
+        <w:t xml:space="preserve">12. Give an example of a strongly connected directed graph </w:t>
+      </w:r>
+      <w:r>
+        <w:rPr>
+          <w:rFonts w:ascii="Cambria Math" w:eastAsia="Cambria Math" w:hAnsi="Cambria Math" w:cs="Cambria Math"/>
+        </w:rPr>
+        <w:t>G = (V, E)</w:t>
+      </w:r>
+      <w:r>
+        <w:t xml:space="preserve"> such that, for every </w:t>
+      </w:r>
+      <w:r>
+        <w:rPr>
+          <w:rFonts w:ascii="Cambria Math" w:eastAsia="Cambria Math" w:hAnsi="Cambria Math" w:cs="Cambria Math"/>
+        </w:rPr>
+        <w:t>v ∈ V</w:t>
+      </w:r>
+      <w:r>
+        <w:t xml:space="preserve">, removing </w:t>
+      </w:r>
+      <w:r>
+        <w:rPr>
+          <w:rFonts w:ascii="Cambria Math" w:eastAsia="Cambria Math" w:hAnsi="Cambria Math" w:cs="Cambria Math"/>
+        </w:rPr>
+        <w:t>v</w:t>
+      </w:r>
+      <w:r>
+        <w:t xml:space="preserve"> from </w:t>
+      </w:r>
+      <w:r>
+        <w:rPr>
+          <w:rFonts w:ascii="Cambria Math" w:eastAsia="Cambria Math" w:hAnsi="Cambria Math" w:cs="Cambria Math"/>
+        </w:rPr>
+        <w:t>G</w:t>
+      </w:r>
+      <w:r>
+        <w:t xml:space="preserve"> leaves a directed graph that is not strongly connected.</w:t>
+      </w:r>
+    </w:p>
+    <w:p>
+      <w:pPr>
+        <w:pStyle w:val="Heading3"/>
+      </w:pPr>
+      <w:r>
+        <w:t xml:space="preserve">13. True or False? (Proof or counterexample) If a depth-first search on a directed graph </w:t>
+      </w:r>
+      <w:r>
+        <w:rPr>
+          <w:rFonts w:ascii="Cambria Math" w:eastAsia="Cambria Math" w:hAnsi="Cambria Math" w:cs="Cambria Math"/>
+        </w:rPr>
+        <w:t>G = (V, E)</w:t>
+      </w:r>
+      <w:r>
+        <w:t xml:space="preserve"> produces exactly one back edge, then it is possible to choose an edge </w:t>
+      </w:r>
+      <w:r>
+        <w:rPr>
+          <w:rFonts w:ascii="Cambria Math" w:eastAsia="Cambria Math" w:hAnsi="Cambria Math" w:cs="Cambria Math"/>
+        </w:rPr>
+        <w:t>e ∈ E</w:t>
+      </w:r>
+      <w:r>
+        <w:t xml:space="preserve"> such that the graph without </w:t>
+      </w:r>
+      <w:r>
+        <w:rPr>
+          <w:rFonts w:ascii="Cambria Math" w:eastAsia="Cambria Math" w:hAnsi="Cambria Math" w:cs="Cambria Math"/>
+        </w:rPr>
+        <w:t>e</w:t>
+      </w:r>
+      <w:r>
+        <w:t xml:space="preserve"> (</w:t>
+      </w:r>
+      <w:r>
+        <w:rPr>
+          <w:rFonts w:ascii="Cambria Math" w:eastAsia="Cambria Math" w:hAnsi="Cambria Math" w:cs="Cambria Math"/>
+        </w:rPr>
+        <w:t>G′ = (V, E \ {e})</w:t>
+      </w:r>
+      <w:r>
+        <w:t>) is acyclic.</w:t>
+      </w:r>
+    </w:p>
+    <w:p>
+      <w:pPr>
+        <w:pStyle w:val="Heading3"/>
+      </w:pPr>
+      <w:r>
+        <w:t xml:space="preserve">14. True or False? (Proof or counterexample) If a directed graph </w:t>
+      </w:r>
+      <w:r>
+        <w:rPr>
+          <w:rFonts w:ascii="Cambria Math" w:eastAsia="Cambria Math" w:hAnsi="Cambria Math" w:cs="Cambria Math"/>
+        </w:rPr>
+        <w:t>G = (V, E)</w:t>
+      </w:r>
+      <w:r>
+        <w:t xml:space="preserve"> is cyclic but can be made acyclic by removing one edge, then a depth-first search in </w:t>
+      </w:r>
+      <w:r>
+        <w:rPr>
+          <w:rFonts w:ascii="Cambria Math" w:eastAsia="Cambria Math" w:hAnsi="Cambria Math" w:cs="Cambria Math"/>
+        </w:rPr>
+        <w:t>G</w:t>
+      </w:r>
+      <w:r>
+        <w:t xml:space="preserve"> will encounter exactly one back edge.</w:t>
+      </w:r>
+    </w:p>
+    <w:p>
+      <w:pPr>
+        <w:pStyle w:val="Heading3"/>
+      </w:pPr>
+      <w:r>
+        <w:t>15. Modify the Breadth First Search algorithm to handle directed graphs.</w:t>
+      </w:r>
+    </w:p>
+    <w:p>
+      <w:pPr>
+        <w:pStyle w:val="Heading3"/>
+      </w:pPr>
+      <w:r>
+        <w:t xml:space="preserve">16. Suppose a CS curriculum consists of </w:t>
+      </w:r>
+      <w:r>
+        <w:rPr>
+          <w:rFonts w:ascii="Cambria Math" w:eastAsia="Cambria Math" w:hAnsi="Cambria Math" w:cs="Cambria Math"/>
+        </w:rPr>
+        <w:t>n</w:t>
+      </w:r>
+      <w:r>
+        <w:t xml:space="preserve"> courses, all of them mandatory. The prerequisite graph </w:t>
+      </w:r>
+      <w:r>
+        <w:rPr>
+          <w:rFonts w:ascii="Cambria Math" w:eastAsia="Cambria Math" w:hAnsi="Cambria Math" w:cs="Cambria Math"/>
+        </w:rPr>
+        <w:t>G</w:t>
+      </w:r>
+      <w:r>
+        <w:t xml:space="preserve"> has a vertex for each course, and an edge from course </w:t>
+      </w:r>
+      <w:r>
+        <w:rPr>
+          <w:rFonts w:ascii="Cambria Math" w:eastAsia="Cambria Math" w:hAnsi="Cambria Math" w:cs="Cambria Math"/>
+        </w:rPr>
+        <w:t>v</w:t>
+      </w:r>
+      <w:r>
+        <w:t xml:space="preserve"> to course </w:t>
+      </w:r>
+      <w:r>
+        <w:rPr>
+          <w:rFonts w:ascii="Cambria Math" w:eastAsia="Cambria Math" w:hAnsi="Cambria Math" w:cs="Cambria Math"/>
+        </w:rPr>
+        <w:t>w</w:t>
+      </w:r>
+      <w:r>
+        <w:t xml:space="preserve"> if and only if </w:t>
+      </w:r>
+      <w:r>
+        <w:rPr>
+          <w:rFonts w:ascii="Cambria Math" w:eastAsia="Cambria Math" w:hAnsi="Cambria Math" w:cs="Cambria Math"/>
+        </w:rPr>
+        <w:t>v</w:t>
+      </w:r>
+      <w:r>
+        <w:t xml:space="preserve"> is a prerequisite for </w:t>
+      </w:r>
+      <w:r>
+        <w:rPr>
+          <w:rFonts w:ascii="Cambria Math" w:eastAsia="Cambria Math" w:hAnsi="Cambria Math" w:cs="Cambria Math"/>
+        </w:rPr>
+        <w:t>w</w:t>
+      </w:r>
+      <w:r>
+        <w:t xml:space="preserve">. Design </w:t>
+      </w:r>
+      <w:r>
         <w:lastRenderedPageBreak/>
-        <w:t>Does the same hold true for directed graphs (and strongly connected components rather than connected components)? (Proof or counterexample)</w:t>
-      </w:r>
-    </w:p>
-    <w:p>
-      <w:pPr>
-        <w:pStyle w:val="Heading3"/>
-      </w:pPr>
-      <w:r>
-        <w:t xml:space="preserve">12. Give an example of a strongly connected directed graph </w:t>
-      </w:r>
-      <w:r>
-        <w:rPr>
-          <w:rFonts w:ascii="Cambria Math" w:eastAsia="Cambria Math" w:hAnsi="Cambria Math" w:cs="Cambria Math"/>
-        </w:rPr>
-        <w:t>G = (V, E)</w:t>
-      </w:r>
-      <w:r>
-        <w:t xml:space="preserve"> such that, for every </w:t>
-      </w:r>
-      <w:r>
-        <w:rPr>
-          <w:rFonts w:ascii="Cambria Math" w:eastAsia="Cambria Math" w:hAnsi="Cambria Math" w:cs="Cambria Math"/>
-        </w:rPr>
-        <w:t>v ∈ V</w:t>
-      </w:r>
-      <w:r>
-        <w:t xml:space="preserve">, removing </w:t>
-      </w:r>
-      <w:r>
-        <w:rPr>
-          <w:rFonts w:ascii="Cambria Math" w:eastAsia="Cambria Math" w:hAnsi="Cambria Math" w:cs="Cambria Math"/>
-        </w:rPr>
-        <w:t>v</w:t>
-      </w:r>
-      <w:r>
-        <w:t xml:space="preserve"> from </w:t>
-      </w:r>
-      <w:r>
-        <w:rPr>
-          <w:rFonts w:ascii="Cambria Math" w:eastAsia="Cambria Math" w:hAnsi="Cambria Math" w:cs="Cambria Math"/>
-        </w:rPr>
-        <w:t>G</w:t>
-      </w:r>
-      <w:r>
-        <w:t xml:space="preserve"> leaves a directed graph that is not strongly connected.</w:t>
-      </w:r>
-    </w:p>
-    <w:p>
-      <w:pPr>
-        <w:pStyle w:val="Heading3"/>
-      </w:pPr>
-      <w:r>
-        <w:t xml:space="preserve">13. True or False? (Proof or counterexample) If a depth-first search on a directed graph </w:t>
-      </w:r>
-      <w:r>
-        <w:rPr>
-          <w:rFonts w:ascii="Cambria Math" w:eastAsia="Cambria Math" w:hAnsi="Cambria Math" w:cs="Cambria Math"/>
-        </w:rPr>
-        <w:t>G = (V, E)</w:t>
-      </w:r>
-      <w:r>
-        <w:t xml:space="preserve"> produces exactly one back edge, then it is possible to choose an edge </w:t>
-      </w:r>
-      <w:r>
-        <w:rPr>
-          <w:rFonts w:ascii="Cambria Math" w:eastAsia="Cambria Math" w:hAnsi="Cambria Math" w:cs="Cambria Math"/>
-        </w:rPr>
-        <w:t>e ∈ E</w:t>
-      </w:r>
-      <w:r>
-        <w:t xml:space="preserve"> such that the graph without </w:t>
-      </w:r>
-      <w:r>
-        <w:rPr>
-          <w:rFonts w:ascii="Cambria Math" w:eastAsia="Cambria Math" w:hAnsi="Cambria Math" w:cs="Cambria Math"/>
-        </w:rPr>
-        <w:t>e</w:t>
-      </w:r>
-      <w:r>
-        <w:t xml:space="preserve"> (</w:t>
-      </w:r>
-      <w:r>
-        <w:rPr>
-          <w:rFonts w:ascii="Cambria Math" w:eastAsia="Cambria Math" w:hAnsi="Cambria Math" w:cs="Cambria Math"/>
-        </w:rPr>
-        <w:t>G′ = (V, E \ {e})</w:t>
-      </w:r>
-      <w:r>
-        <w:t>) is acyclic.</w:t>
-      </w:r>
-    </w:p>
-    <w:p>
-      <w:pPr>
-        <w:pStyle w:val="Heading3"/>
-      </w:pPr>
-      <w:r>
-        <w:t xml:space="preserve">14. True or False? (Proof or counterexample) If a directed graph </w:t>
-      </w:r>
-      <w:r>
-        <w:rPr>
-          <w:rFonts w:ascii="Cambria Math" w:eastAsia="Cambria Math" w:hAnsi="Cambria Math" w:cs="Cambria Math"/>
-        </w:rPr>
-        <w:t>G = (V, E)</w:t>
-      </w:r>
-      <w:r>
-        <w:t xml:space="preserve"> is cyclic but can be made acyclic by removing one edge, then a depth-first search in </w:t>
-      </w:r>
-      <w:r>
-        <w:rPr>
-          <w:rFonts w:ascii="Cambria Math" w:eastAsia="Cambria Math" w:hAnsi="Cambria Math" w:cs="Cambria Math"/>
-        </w:rPr>
-        <w:t>G</w:t>
-      </w:r>
-      <w:r>
-        <w:t xml:space="preserve"> will encounter exactly one back edge.</w:t>
-      </w:r>
-    </w:p>
-    <w:p>
-      <w:pPr>
-        <w:pStyle w:val="Heading3"/>
-      </w:pPr>
-      <w:r>
-        <w:t>15. Modify the Breadth First Search algorithm to handle directed graphs.</w:t>
-      </w:r>
-    </w:p>
-    <w:p>
-      <w:pPr>
-        <w:pStyle w:val="Heading3"/>
-      </w:pPr>
-      <w:r>
-        <w:t xml:space="preserve">16. Suppose a CS curriculum consists of </w:t>
-      </w:r>
-      <w:r>
-        <w:rPr>
-          <w:rFonts w:ascii="Cambria Math" w:eastAsia="Cambria Math" w:hAnsi="Cambria Math" w:cs="Cambria Math"/>
-        </w:rPr>
-        <w:t>n</w:t>
-      </w:r>
-      <w:r>
-        <w:t xml:space="preserve"> courses, all of them mandatory. The prerequisite graph </w:t>
-      </w:r>
-      <w:r>
-        <w:rPr>
-          <w:rFonts w:ascii="Cambria Math" w:eastAsia="Cambria Math" w:hAnsi="Cambria Math" w:cs="Cambria Math"/>
-        </w:rPr>
-        <w:t>G</w:t>
-      </w:r>
-      <w:r>
-        <w:t xml:space="preserve"> has a vertex for each course, and an edge from course </w:t>
-      </w:r>
-      <w:r>
-        <w:rPr>
-          <w:rFonts w:ascii="Cambria Math" w:eastAsia="Cambria Math" w:hAnsi="Cambria Math" w:cs="Cambria Math"/>
-        </w:rPr>
-        <w:t>v</w:t>
-      </w:r>
-      <w:r>
-        <w:t xml:space="preserve"> to course </w:t>
-      </w:r>
-      <w:r>
-        <w:rPr>
-          <w:rFonts w:ascii="Cambria Math" w:eastAsia="Cambria Math" w:hAnsi="Cambria Math" w:cs="Cambria Math"/>
-        </w:rPr>
-        <w:t>w</w:t>
-      </w:r>
-      <w:r>
-        <w:t xml:space="preserve"> if and only if </w:t>
-      </w:r>
-      <w:r>
-        <w:rPr>
-          <w:rFonts w:ascii="Cambria Math" w:eastAsia="Cambria Math" w:hAnsi="Cambria Math" w:cs="Cambria Math"/>
-        </w:rPr>
-        <w:t>v</w:t>
-      </w:r>
-      <w:r>
-        <w:t xml:space="preserve"> is a prerequisite for </w:t>
-      </w:r>
-      <w:r>
-        <w:rPr>
-          <w:rFonts w:ascii="Cambria Math" w:eastAsia="Cambria Math" w:hAnsi="Cambria Math" w:cs="Cambria Math"/>
-        </w:rPr>
-        <w:t>w</w:t>
-      </w:r>
-      <w:r>
-        <w:t>. Design and analyze an algorithm that works directly with this graph representation, and computes the minimum number of quarters necessary to complete the curriculum (assume that a student can take any number of courses in one quarter).</w:t>
+        <w:t>and analyze an algorithm that works directly with this graph representation, and computes the minimum number of quarters necessary to complete the curriculum (assume that a student can take any number of courses in one quarter).</w:t>
       </w:r>
     </w:p>
     <w:p>
@@ -1066,7 +1246,6 @@
         <w:rPr>
           <w:noProof/>
         </w:rPr>
-        <w:lastRenderedPageBreak/>
         <w:drawing>
           <wp:inline distT="0" distB="0" distL="0" distR="0" wp14:anchorId="5E4BE969" wp14:editId="3AC1C224">
             <wp:extent cx="3600931" cy="2095500"/>
@@ -1175,7 +1354,7 @@
 </file>
 
 <file path=word/endnotes.xml><?xml version="1.0" encoding="utf-8"?>
-<w:endnotes xmlns:wpc="http://schemas.microsoft.com/office/word/2010/wordprocessingCanvas" xmlns:cx="http://schemas.microsoft.com/office/drawing/2014/chartex" xmlns:cx1="http://schemas.microsoft.com/office/drawing/2015/9/8/chartex" xmlns:cx2="http://schemas.microsoft.com/office/drawing/2015/10/21/chartex" xmlns:cx3="http://schemas.microsoft.com/office/drawing/2016/5/9/chartex" xmlns:cx4="http://schemas.microsoft.com/office/drawing/2016/5/10/chartex" xmlns:cx5="http://schemas.microsoft.com/office/drawing/2016/5/11/chartex" xmlns:cx6="http://schemas.microsoft.com/office/drawing/2016/5/12/chartex" xmlns:cx7="http://schemas.microsoft.com/office/drawing/2016/5/13/chartex" xmlns:cx8="http://schemas.microsoft.com/office/drawing/2016/5/14/chartex" xmlns:mc="http://schemas.openxmlformats.org/markup-compatibility/2006" xmlns:aink="http://schemas.microsoft.com/office/drawing/2016/ink" xmlns:am3d="http://schemas.microsoft.com/office/drawing/2017/model3d" xmlns:o="urn:schemas-microsoft-com:office:office" xmlns:oel="http://schemas.microsoft.com/office/2019/extlst" xmlns:r="http://schemas.openxmlformats.org/officeDocument/2006/relationships" xmlns:m="http://schemas.openxmlformats.org/officeDocument/2006/math" xmlns:v="urn:schemas-microsoft-com:vml" xmlns:wp14="http://schemas.microsoft.com/office/word/2010/wordprocessingDrawing" xmlns:wp="http://schemas.openxmlformats.org/drawingml/2006/wordprocessingDrawing" xmlns:w10="urn:schemas-microsoft-com:office:word" xmlns:w="http://schemas.openxmlformats.org/wordprocessingml/2006/main" xmlns:w14="http://schemas.microsoft.com/office/word/2010/wordml" xmlns:w15="http://schemas.microsoft.com/office/word/2012/wordml" xmlns:w16cex="http://schemas.microsoft.com/office/word/2018/wordml/cex" xmlns:w16cid="http://schemas.microsoft.com/office/word/2016/wordml/cid" xmlns:w16="http://schemas.microsoft.com/office/word/2018/wordml" xmlns:w16du="http://schemas.microsoft.com/office/word/2023/wordml/word16du" xmlns:w16sdtdh="http://schemas.microsoft.com/office/word/2020/wordml/sdtdatahash" xmlns:w16sdtfl="http://schemas.microsoft.com/office/word/2024/wordml/sdtformatlock" xmlns:w16se="http://schemas.microsoft.com/office/word/2015/wordml/symex" xmlns:wpg="http://schemas.microsoft.com/office/word/2010/wordprocessingGroup" xmlns:wpi="http://schemas.microsoft.com/office/word/2010/wordprocessingInk" xmlns:wne="http://schemas.microsoft.com/office/word/2006/wordml" xmlns:wps="http://schemas.microsoft.com/office/word/2010/wordprocessingShape" mc:Ignorable="w14 w15 w16se w16cid w16 w16cex w16sdtdh w16sdtfl w16du wp14">
+<w:endnotes xmlns:wpc="http://schemas.microsoft.com/office/word/2010/wordprocessingCanvas" xmlns:cx="http://schemas.microsoft.com/office/drawing/2014/chartex" xmlns:cx1="http://schemas.microsoft.com/office/drawing/2015/9/8/chartex" xmlns:cx2="http://schemas.microsoft.com/office/drawing/2015/10/21/chartex" xmlns:cx3="http://schemas.microsoft.com/office/drawing/2016/5/9/chartex" xmlns:cx4="http://schemas.microsoft.com/office/drawing/2016/5/10/chartex" xmlns:cx5="http://schemas.microsoft.com/office/drawing/2016/5/11/chartex" xmlns:cx6="http://schemas.microsoft.com/office/drawing/2016/5/12/chartex" xmlns:cx7="http://schemas.microsoft.com/office/drawing/2016/5/13/chartex" xmlns:cx8="http://schemas.microsoft.com/office/drawing/2016/5/14/chartex" xmlns:mc="http://schemas.openxmlformats.org/markup-compatibility/2006" xmlns:m="http://schemas.openxmlformats.org/officeDocument/2006/math" xmlns:aink="http://schemas.microsoft.com/office/drawing/2016/ink" xmlns:am3d="http://schemas.microsoft.com/office/drawing/2017/model3d" xmlns:oel="http://schemas.microsoft.com/office/2019/extlst" xmlns:r="http://schemas.openxmlformats.org/officeDocument/2006/relationships" xmlns:wp14="http://schemas.microsoft.com/office/word/2010/wordprocessingDrawing" xmlns:wp="http://schemas.openxmlformats.org/drawingml/2006/wordprocessingDrawing" xmlns:wpg="http://schemas.microsoft.com/office/word/2010/wordprocessingGroup" xmlns:wpi="http://schemas.microsoft.com/office/word/2010/wordprocessingInk" xmlns:wps="http://schemas.microsoft.com/office/word/2010/wordprocessingShape" xmlns:o="urn:schemas-microsoft-com:office:office" xmlns:v="urn:schemas-microsoft-com:vml" xmlns:w10="urn:schemas-microsoft-com:office:word" xmlns:w="http://schemas.openxmlformats.org/wordprocessingml/2006/main" xmlns:w14="http://schemas.microsoft.com/office/word/2010/wordml" xmlns:w15="http://schemas.microsoft.com/office/word/2012/wordml" xmlns:w16cex="http://schemas.microsoft.com/office/word/2018/wordml/cex" xmlns:w16cid="http://schemas.microsoft.com/office/word/2016/wordml/cid" xmlns:w16="http://schemas.microsoft.com/office/word/2018/wordml" xmlns:w16sdtdh="http://schemas.microsoft.com/office/word/2020/wordml/sdtdatahash" xmlns:w16sdtfl="http://schemas.microsoft.com/office/word/2024/wordml/sdtformatlock" xmlns:w16se="http://schemas.microsoft.com/office/word/2015/wordml/symex" xmlns:w16du="http://schemas.microsoft.com/office/word/2023/wordml/word16du" xmlns:wne="http://schemas.microsoft.com/office/word/2006/wordml" mc:Ignorable="w14 w15 w16se w16cid w16 w16cex w16sdtdh w16sdtfl w16du wp14">
   <w:endnote w:type="separator" w:id="-1">
     <w:p>
       <w:r>
@@ -1194,7 +1373,7 @@
 </file>
 
 <file path=word/footer1.xml><?xml version="1.0" encoding="utf-8"?>
-<w:ftr xmlns:wpc="http://schemas.microsoft.com/office/word/2010/wordprocessingCanvas" xmlns:cx="http://schemas.microsoft.com/office/drawing/2014/chartex" xmlns:cx1="http://schemas.microsoft.com/office/drawing/2015/9/8/chartex" xmlns:cx2="http://schemas.microsoft.com/office/drawing/2015/10/21/chartex" xmlns:cx3="http://schemas.microsoft.com/office/drawing/2016/5/9/chartex" xmlns:cx4="http://schemas.microsoft.com/office/drawing/2016/5/10/chartex" xmlns:cx5="http://schemas.microsoft.com/office/drawing/2016/5/11/chartex" xmlns:cx6="http://schemas.microsoft.com/office/drawing/2016/5/12/chartex" xmlns:cx7="http://schemas.microsoft.com/office/drawing/2016/5/13/chartex" xmlns:cx8="http://schemas.microsoft.com/office/drawing/2016/5/14/chartex" xmlns:mc="http://schemas.openxmlformats.org/markup-compatibility/2006" xmlns:aink="http://schemas.microsoft.com/office/drawing/2016/ink" xmlns:am3d="http://schemas.microsoft.com/office/drawing/2017/model3d" xmlns:o="urn:schemas-microsoft-com:office:office" xmlns:oel="http://schemas.microsoft.com/office/2019/extlst" xmlns:r="http://schemas.openxmlformats.org/officeDocument/2006/relationships" xmlns:m="http://schemas.openxmlformats.org/officeDocument/2006/math" xmlns:v="urn:schemas-microsoft-com:vml" xmlns:wp14="http://schemas.microsoft.com/office/word/2010/wordprocessingDrawing" xmlns:wp="http://schemas.openxmlformats.org/drawingml/2006/wordprocessingDrawing" xmlns:w10="urn:schemas-microsoft-com:office:word" xmlns:w="http://schemas.openxmlformats.org/wordprocessingml/2006/main" xmlns:w14="http://schemas.microsoft.com/office/word/2010/wordml" xmlns:w15="http://schemas.microsoft.com/office/word/2012/wordml" xmlns:w16cex="http://schemas.microsoft.com/office/word/2018/wordml/cex" xmlns:w16cid="http://schemas.microsoft.com/office/word/2016/wordml/cid" xmlns:w16="http://schemas.microsoft.com/office/word/2018/wordml" xmlns:w16du="http://schemas.microsoft.com/office/word/2023/wordml/word16du" xmlns:w16sdtdh="http://schemas.microsoft.com/office/word/2020/wordml/sdtdatahash" xmlns:w16sdtfl="http://schemas.microsoft.com/office/word/2024/wordml/sdtformatlock" xmlns:w16se="http://schemas.microsoft.com/office/word/2015/wordml/symex" xmlns:wpg="http://schemas.microsoft.com/office/word/2010/wordprocessingGroup" xmlns:wpi="http://schemas.microsoft.com/office/word/2010/wordprocessingInk" xmlns:wne="http://schemas.microsoft.com/office/word/2006/wordml" xmlns:wps="http://schemas.microsoft.com/office/word/2010/wordprocessingShape" mc:Ignorable="w14 w15 w16se w16cid w16 w16cex w16sdtdh w16sdtfl w16du wp14">
+<w:ftr xmlns:wpc="http://schemas.microsoft.com/office/word/2010/wordprocessingCanvas" xmlns:cx="http://schemas.microsoft.com/office/drawing/2014/chartex" xmlns:cx1="http://schemas.microsoft.com/office/drawing/2015/9/8/chartex" xmlns:cx2="http://schemas.microsoft.com/office/drawing/2015/10/21/chartex" xmlns:cx3="http://schemas.microsoft.com/office/drawing/2016/5/9/chartex" xmlns:cx4="http://schemas.microsoft.com/office/drawing/2016/5/10/chartex" xmlns:cx5="http://schemas.microsoft.com/office/drawing/2016/5/11/chartex" xmlns:cx6="http://schemas.microsoft.com/office/drawing/2016/5/12/chartex" xmlns:cx7="http://schemas.microsoft.com/office/drawing/2016/5/13/chartex" xmlns:cx8="http://schemas.microsoft.com/office/drawing/2016/5/14/chartex" xmlns:mc="http://schemas.openxmlformats.org/markup-compatibility/2006" xmlns:m="http://schemas.openxmlformats.org/officeDocument/2006/math" xmlns:aink="http://schemas.microsoft.com/office/drawing/2016/ink" xmlns:am3d="http://schemas.microsoft.com/office/drawing/2017/model3d" xmlns:oel="http://schemas.microsoft.com/office/2019/extlst" xmlns:r="http://schemas.openxmlformats.org/officeDocument/2006/relationships" xmlns:wp14="http://schemas.microsoft.com/office/word/2010/wordprocessingDrawing" xmlns:wp="http://schemas.openxmlformats.org/drawingml/2006/wordprocessingDrawing" xmlns:wpg="http://schemas.microsoft.com/office/word/2010/wordprocessingGroup" xmlns:wpi="http://schemas.microsoft.com/office/word/2010/wordprocessingInk" xmlns:wps="http://schemas.microsoft.com/office/word/2010/wordprocessingShape" xmlns:o="urn:schemas-microsoft-com:office:office" xmlns:v="urn:schemas-microsoft-com:vml" xmlns:w10="urn:schemas-microsoft-com:office:word" xmlns:w="http://schemas.openxmlformats.org/wordprocessingml/2006/main" xmlns:w14="http://schemas.microsoft.com/office/word/2010/wordml" xmlns:w15="http://schemas.microsoft.com/office/word/2012/wordml" xmlns:w16cex="http://schemas.microsoft.com/office/word/2018/wordml/cex" xmlns:w16cid="http://schemas.microsoft.com/office/word/2016/wordml/cid" xmlns:w16="http://schemas.microsoft.com/office/word/2018/wordml" xmlns:w16sdtdh="http://schemas.microsoft.com/office/word/2020/wordml/sdtdatahash" xmlns:w16sdtfl="http://schemas.microsoft.com/office/word/2024/wordml/sdtformatlock" xmlns:w16se="http://schemas.microsoft.com/office/word/2015/wordml/symex" xmlns:w16du="http://schemas.microsoft.com/office/word/2023/wordml/word16du" xmlns:wne="http://schemas.microsoft.com/office/word/2006/wordml" mc:Ignorable="w14 w15 w16se w16cid w16 w16cex w16sdtdh w16sdtfl w16du wp14">
   <w:p>
     <w:pPr>
       <w:jc w:val="center"/>
@@ -1243,7 +1422,7 @@
 </file>
 
 <file path=word/footnotes.xml><?xml version="1.0" encoding="utf-8"?>
-<w:footnotes xmlns:wpc="http://schemas.microsoft.com/office/word/2010/wordprocessingCanvas" xmlns:cx="http://schemas.microsoft.com/office/drawing/2014/chartex" xmlns:cx1="http://schemas.microsoft.com/office/drawing/2015/9/8/chartex" xmlns:cx2="http://schemas.microsoft.com/office/drawing/2015/10/21/chartex" xmlns:cx3="http://schemas.microsoft.com/office/drawing/2016/5/9/chartex" xmlns:cx4="http://schemas.microsoft.com/office/drawing/2016/5/10/chartex" xmlns:cx5="http://schemas.microsoft.com/office/drawing/2016/5/11/chartex" xmlns:cx6="http://schemas.microsoft.com/office/drawing/2016/5/12/chartex" xmlns:cx7="http://schemas.microsoft.com/office/drawing/2016/5/13/chartex" xmlns:cx8="http://schemas.microsoft.com/office/drawing/2016/5/14/chartex" xmlns:mc="http://schemas.openxmlformats.org/markup-compatibility/2006" xmlns:aink="http://schemas.microsoft.com/office/drawing/2016/ink" xmlns:am3d="http://schemas.microsoft.com/office/drawing/2017/model3d" xmlns:o="urn:schemas-microsoft-com:office:office" xmlns:oel="http://schemas.microsoft.com/office/2019/extlst" xmlns:r="http://schemas.openxmlformats.org/officeDocument/2006/relationships" xmlns:m="http://schemas.openxmlformats.org/officeDocument/2006/math" xmlns:v="urn:schemas-microsoft-com:vml" xmlns:wp14="http://schemas.microsoft.com/office/word/2010/wordprocessingDrawing" xmlns:wp="http://schemas.openxmlformats.org/drawingml/2006/wordprocessingDrawing" xmlns:w10="urn:schemas-microsoft-com:office:word" xmlns:w="http://schemas.openxmlformats.org/wordprocessingml/2006/main" xmlns:w14="http://schemas.microsoft.com/office/word/2010/wordml" xmlns:w15="http://schemas.microsoft.com/office/word/2012/wordml" xmlns:w16cex="http://schemas.microsoft.com/office/word/2018/wordml/cex" xmlns:w16cid="http://schemas.microsoft.com/office/word/2016/wordml/cid" xmlns:w16="http://schemas.microsoft.com/office/word/2018/wordml" xmlns:w16du="http://schemas.microsoft.com/office/word/2023/wordml/word16du" xmlns:w16sdtdh="http://schemas.microsoft.com/office/word/2020/wordml/sdtdatahash" xmlns:w16sdtfl="http://schemas.microsoft.com/office/word/2024/wordml/sdtformatlock" xmlns:w16se="http://schemas.microsoft.com/office/word/2015/wordml/symex" xmlns:wpg="http://schemas.microsoft.com/office/word/2010/wordprocessingGroup" xmlns:wpi="http://schemas.microsoft.com/office/word/2010/wordprocessingInk" xmlns:wne="http://schemas.microsoft.com/office/word/2006/wordml" xmlns:wps="http://schemas.microsoft.com/office/word/2010/wordprocessingShape" mc:Ignorable="w14 w15 w16se w16cid w16 w16cex w16sdtdh w16sdtfl w16du wp14">
+<w:footnotes xmlns:wpc="http://schemas.microsoft.com/office/word/2010/wordprocessingCanvas" xmlns:cx="http://schemas.microsoft.com/office/drawing/2014/chartex" xmlns:cx1="http://schemas.microsoft.com/office/drawing/2015/9/8/chartex" xmlns:cx2="http://schemas.microsoft.com/office/drawing/2015/10/21/chartex" xmlns:cx3="http://schemas.microsoft.com/office/drawing/2016/5/9/chartex" xmlns:cx4="http://schemas.microsoft.com/office/drawing/2016/5/10/chartex" xmlns:cx5="http://schemas.microsoft.com/office/drawing/2016/5/11/chartex" xmlns:cx6="http://schemas.microsoft.com/office/drawing/2016/5/12/chartex" xmlns:cx7="http://schemas.microsoft.com/office/drawing/2016/5/13/chartex" xmlns:cx8="http://schemas.microsoft.com/office/drawing/2016/5/14/chartex" xmlns:mc="http://schemas.openxmlformats.org/markup-compatibility/2006" xmlns:m="http://schemas.openxmlformats.org/officeDocument/2006/math" xmlns:aink="http://schemas.microsoft.com/office/drawing/2016/ink" xmlns:am3d="http://schemas.microsoft.com/office/drawing/2017/model3d" xmlns:oel="http://schemas.microsoft.com/office/2019/extlst" xmlns:r="http://schemas.openxmlformats.org/officeDocument/2006/relationships" xmlns:wp14="http://schemas.microsoft.com/office/word/2010/wordprocessingDrawing" xmlns:wp="http://schemas.openxmlformats.org/drawingml/2006/wordprocessingDrawing" xmlns:wpg="http://schemas.microsoft.com/office/word/2010/wordprocessingGroup" xmlns:wpi="http://schemas.microsoft.com/office/word/2010/wordprocessingInk" xmlns:wps="http://schemas.microsoft.com/office/word/2010/wordprocessingShape" xmlns:o="urn:schemas-microsoft-com:office:office" xmlns:v="urn:schemas-microsoft-com:vml" xmlns:w10="urn:schemas-microsoft-com:office:word" xmlns:w="http://schemas.openxmlformats.org/wordprocessingml/2006/main" xmlns:w14="http://schemas.microsoft.com/office/word/2010/wordml" xmlns:w15="http://schemas.microsoft.com/office/word/2012/wordml" xmlns:w16cex="http://schemas.microsoft.com/office/word/2018/wordml/cex" xmlns:w16cid="http://schemas.microsoft.com/office/word/2016/wordml/cid" xmlns:w16="http://schemas.microsoft.com/office/word/2018/wordml" xmlns:w16sdtdh="http://schemas.microsoft.com/office/word/2020/wordml/sdtdatahash" xmlns:w16sdtfl="http://schemas.microsoft.com/office/word/2024/wordml/sdtformatlock" xmlns:w16se="http://schemas.microsoft.com/office/word/2015/wordml/symex" xmlns:w16du="http://schemas.microsoft.com/office/word/2023/wordml/word16du" xmlns:wne="http://schemas.microsoft.com/office/word/2006/wordml" mc:Ignorable="w14 w15 w16se w16cid w16 w16cex w16sdtdh w16sdtfl w16du wp14">
   <w:footnote w:type="separator" w:id="-1">
     <w:p>
       <w:r>
@@ -1262,7 +1441,7 @@
 </file>
 
 <file path=word/header1.xml><?xml version="1.0" encoding="utf-8"?>
-<w:hdr xmlns:wpc="http://schemas.microsoft.com/office/word/2010/wordprocessingCanvas" xmlns:cx="http://schemas.microsoft.com/office/drawing/2014/chartex" xmlns:cx1="http://schemas.microsoft.com/office/drawing/2015/9/8/chartex" xmlns:cx2="http://schemas.microsoft.com/office/drawing/2015/10/21/chartex" xmlns:cx3="http://schemas.microsoft.com/office/drawing/2016/5/9/chartex" xmlns:cx4="http://schemas.microsoft.com/office/drawing/2016/5/10/chartex" xmlns:cx5="http://schemas.microsoft.com/office/drawing/2016/5/11/chartex" xmlns:cx6="http://schemas.microsoft.com/office/drawing/2016/5/12/chartex" xmlns:cx7="http://schemas.microsoft.com/office/drawing/2016/5/13/chartex" xmlns:cx8="http://schemas.microsoft.com/office/drawing/2016/5/14/chartex" xmlns:mc="http://schemas.openxmlformats.org/markup-compatibility/2006" xmlns:aink="http://schemas.microsoft.com/office/drawing/2016/ink" xmlns:am3d="http://schemas.microsoft.com/office/drawing/2017/model3d" xmlns:o="urn:schemas-microsoft-com:office:office" xmlns:oel="http://schemas.microsoft.com/office/2019/extlst" xmlns:r="http://schemas.openxmlformats.org/officeDocument/2006/relationships" xmlns:m="http://schemas.openxmlformats.org/officeDocument/2006/math" xmlns:v="urn:schemas-microsoft-com:vml" xmlns:wp14="http://schemas.microsoft.com/office/word/2010/wordprocessingDrawing" xmlns:wp="http://schemas.openxmlformats.org/drawingml/2006/wordprocessingDrawing" xmlns:w10="urn:schemas-microsoft-com:office:word" xmlns:w="http://schemas.openxmlformats.org/wordprocessingml/2006/main" xmlns:w14="http://schemas.microsoft.com/office/word/2010/wordml" xmlns:w15="http://schemas.microsoft.com/office/word/2012/wordml" xmlns:w16cex="http://schemas.microsoft.com/office/word/2018/wordml/cex" xmlns:w16cid="http://schemas.microsoft.com/office/word/2016/wordml/cid" xmlns:w16="http://schemas.microsoft.com/office/word/2018/wordml" xmlns:w16du="http://schemas.microsoft.com/office/word/2023/wordml/word16du" xmlns:w16sdtdh="http://schemas.microsoft.com/office/word/2020/wordml/sdtdatahash" xmlns:w16sdtfl="http://schemas.microsoft.com/office/word/2024/wordml/sdtformatlock" xmlns:w16se="http://schemas.microsoft.com/office/word/2015/wordml/symex" xmlns:wpg="http://schemas.microsoft.com/office/word/2010/wordprocessingGroup" xmlns:wpi="http://schemas.microsoft.com/office/word/2010/wordprocessingInk" xmlns:wne="http://schemas.microsoft.com/office/word/2006/wordml" xmlns:wps="http://schemas.microsoft.com/office/word/2010/wordprocessingShape" mc:Ignorable="w14 w15 w16se w16cid w16 w16cex w16sdtdh w16sdtfl w16du wp14">
+<w:hdr xmlns:wpc="http://schemas.microsoft.com/office/word/2010/wordprocessingCanvas" xmlns:cx="http://schemas.microsoft.com/office/drawing/2014/chartex" xmlns:cx1="http://schemas.microsoft.com/office/drawing/2015/9/8/chartex" xmlns:cx2="http://schemas.microsoft.com/office/drawing/2015/10/21/chartex" xmlns:cx3="http://schemas.microsoft.com/office/drawing/2016/5/9/chartex" xmlns:cx4="http://schemas.microsoft.com/office/drawing/2016/5/10/chartex" xmlns:cx5="http://schemas.microsoft.com/office/drawing/2016/5/11/chartex" xmlns:cx6="http://schemas.microsoft.com/office/drawing/2016/5/12/chartex" xmlns:cx7="http://schemas.microsoft.com/office/drawing/2016/5/13/chartex" xmlns:cx8="http://schemas.microsoft.com/office/drawing/2016/5/14/chartex" xmlns:mc="http://schemas.openxmlformats.org/markup-compatibility/2006" xmlns:m="http://schemas.openxmlformats.org/officeDocument/2006/math" xmlns:aink="http://schemas.microsoft.com/office/drawing/2016/ink" xmlns:am3d="http://schemas.microsoft.com/office/drawing/2017/model3d" xmlns:oel="http://schemas.microsoft.com/office/2019/extlst" xmlns:r="http://schemas.openxmlformats.org/officeDocument/2006/relationships" xmlns:wp14="http://schemas.microsoft.com/office/word/2010/wordprocessingDrawing" xmlns:wp="http://schemas.openxmlformats.org/drawingml/2006/wordprocessingDrawing" xmlns:wpg="http://schemas.microsoft.com/office/word/2010/wordprocessingGroup" xmlns:wpi="http://schemas.microsoft.com/office/word/2010/wordprocessingInk" xmlns:wps="http://schemas.microsoft.com/office/word/2010/wordprocessingShape" xmlns:o="urn:schemas-microsoft-com:office:office" xmlns:v="urn:schemas-microsoft-com:vml" xmlns:w10="urn:schemas-microsoft-com:office:word" xmlns:w="http://schemas.openxmlformats.org/wordprocessingml/2006/main" xmlns:w14="http://schemas.microsoft.com/office/word/2010/wordml" xmlns:w15="http://schemas.microsoft.com/office/word/2012/wordml" xmlns:w16cex="http://schemas.microsoft.com/office/word/2018/wordml/cex" xmlns:w16cid="http://schemas.microsoft.com/office/word/2016/wordml/cid" xmlns:w16="http://schemas.microsoft.com/office/word/2018/wordml" xmlns:w16sdtdh="http://schemas.microsoft.com/office/word/2020/wordml/sdtdatahash" xmlns:w16sdtfl="http://schemas.microsoft.com/office/word/2024/wordml/sdtformatlock" xmlns:w16se="http://schemas.microsoft.com/office/word/2015/wordml/symex" xmlns:w16du="http://schemas.microsoft.com/office/word/2023/wordml/word16du" xmlns:wne="http://schemas.microsoft.com/office/word/2006/wordml" mc:Ignorable="w14 w15 w16se w16cid w16 w16cex w16sdtdh w16sdtfl w16du wp14">
   <w:p>
     <w:pPr>
       <w:pBdr>
@@ -1306,7 +1485,7 @@
 </file>
 
 <file path=word/numbering.xml><?xml version="1.0" encoding="utf-8"?>
-<w:numbering xmlns:wpc="http://schemas.microsoft.com/office/word/2010/wordprocessingCanvas" xmlns:cx="http://schemas.microsoft.com/office/drawing/2014/chartex" xmlns:cx1="http://schemas.microsoft.com/office/drawing/2015/9/8/chartex" xmlns:cx2="http://schemas.microsoft.com/office/drawing/2015/10/21/chartex" xmlns:cx3="http://schemas.microsoft.com/office/drawing/2016/5/9/chartex" xmlns:cx4="http://schemas.microsoft.com/office/drawing/2016/5/10/chartex" xmlns:cx5="http://schemas.microsoft.com/office/drawing/2016/5/11/chartex" xmlns:cx6="http://schemas.microsoft.com/office/drawing/2016/5/12/chartex" xmlns:cx7="http://schemas.microsoft.com/office/drawing/2016/5/13/chartex" xmlns:cx8="http://schemas.microsoft.com/office/drawing/2016/5/14/chartex" xmlns:mc="http://schemas.openxmlformats.org/markup-compatibility/2006" xmlns:aink="http://schemas.microsoft.com/office/drawing/2016/ink" xmlns:am3d="http://schemas.microsoft.com/office/drawing/2017/model3d" xmlns:o="urn:schemas-microsoft-com:office:office" xmlns:oel="http://schemas.microsoft.com/office/2019/extlst" xmlns:r="http://schemas.openxmlformats.org/officeDocument/2006/relationships" xmlns:m="http://schemas.openxmlformats.org/officeDocument/2006/math" xmlns:v="urn:schemas-microsoft-com:vml" xmlns:wp14="http://schemas.microsoft.com/office/word/2010/wordprocessingDrawing" xmlns:wp="http://schemas.openxmlformats.org/drawingml/2006/wordprocessingDrawing" xmlns:w10="urn:schemas-microsoft-com:office:word" xmlns:w="http://schemas.openxmlformats.org/wordprocessingml/2006/main" xmlns:w14="http://schemas.microsoft.com/office/word/2010/wordml" xmlns:w15="http://schemas.microsoft.com/office/word/2012/wordml" xmlns:w16cex="http://schemas.microsoft.com/office/word/2018/wordml/cex" xmlns:w16cid="http://schemas.microsoft.com/office/word/2016/wordml/cid" xmlns:w16="http://schemas.microsoft.com/office/word/2018/wordml" xmlns:w16du="http://schemas.microsoft.com/office/word/2023/wordml/word16du" xmlns:w16sdtdh="http://schemas.microsoft.com/office/word/2020/wordml/sdtdatahash" xmlns:w16sdtfl="http://schemas.microsoft.com/office/word/2024/wordml/sdtformatlock" xmlns:w16se="http://schemas.microsoft.com/office/word/2015/wordml/symex" xmlns:wpg="http://schemas.microsoft.com/office/word/2010/wordprocessingGroup" xmlns:wpi="http://schemas.microsoft.com/office/word/2010/wordprocessingInk" xmlns:wne="http://schemas.microsoft.com/office/word/2006/wordml" xmlns:wps="http://schemas.microsoft.com/office/word/2010/wordprocessingShape" mc:Ignorable="w14 w15 w16se w16cid w16 w16cex w16sdtdh w16sdtfl w16du wp14">
+<w:numbering xmlns:wpc="http://schemas.microsoft.com/office/word/2010/wordprocessingCanvas" xmlns:cx="http://schemas.microsoft.com/office/drawing/2014/chartex" xmlns:cx1="http://schemas.microsoft.com/office/drawing/2015/9/8/chartex" xmlns:cx2="http://schemas.microsoft.com/office/drawing/2015/10/21/chartex" xmlns:cx3="http://schemas.microsoft.com/office/drawing/2016/5/9/chartex" xmlns:cx4="http://schemas.microsoft.com/office/drawing/2016/5/10/chartex" xmlns:cx5="http://schemas.microsoft.com/office/drawing/2016/5/11/chartex" xmlns:cx6="http://schemas.microsoft.com/office/drawing/2016/5/12/chartex" xmlns:cx7="http://schemas.microsoft.com/office/drawing/2016/5/13/chartex" xmlns:cx8="http://schemas.microsoft.com/office/drawing/2016/5/14/chartex" xmlns:mc="http://schemas.openxmlformats.org/markup-compatibility/2006" xmlns:m="http://schemas.openxmlformats.org/officeDocument/2006/math" xmlns:aink="http://schemas.microsoft.com/office/drawing/2016/ink" xmlns:am3d="http://schemas.microsoft.com/office/drawing/2017/model3d" xmlns:oel="http://schemas.microsoft.com/office/2019/extlst" xmlns:r="http://schemas.openxmlformats.org/officeDocument/2006/relationships" xmlns:wp14="http://schemas.microsoft.com/office/word/2010/wordprocessingDrawing" xmlns:wp="http://schemas.openxmlformats.org/drawingml/2006/wordprocessingDrawing" xmlns:wpg="http://schemas.microsoft.com/office/word/2010/wordprocessingGroup" xmlns:wpi="http://schemas.microsoft.com/office/word/2010/wordprocessingInk" xmlns:wps="http://schemas.microsoft.com/office/word/2010/wordprocessingShape" xmlns:o="urn:schemas-microsoft-com:office:office" xmlns:v="urn:schemas-microsoft-com:vml" xmlns:w10="urn:schemas-microsoft-com:office:word" xmlns:w="http://schemas.openxmlformats.org/wordprocessingml/2006/main" xmlns:w14="http://schemas.microsoft.com/office/word/2010/wordml" xmlns:w15="http://schemas.microsoft.com/office/word/2012/wordml" xmlns:w16cex="http://schemas.microsoft.com/office/word/2018/wordml/cex" xmlns:w16cid="http://schemas.microsoft.com/office/word/2016/wordml/cid" xmlns:w16="http://schemas.microsoft.com/office/word/2018/wordml" xmlns:w16sdtdh="http://schemas.microsoft.com/office/word/2020/wordml/sdtdatahash" xmlns:w16sdtfl="http://schemas.microsoft.com/office/word/2024/wordml/sdtformatlock" xmlns:w16se="http://schemas.microsoft.com/office/word/2015/wordml/symex" xmlns:w16du="http://schemas.microsoft.com/office/word/2023/wordml/word16du" xmlns:wne="http://schemas.microsoft.com/office/word/2006/wordml" mc:Ignorable="w14 w15 w16se w16cid w16 w16cex w16sdtdh w16sdtfl w16du wp14">
   <w:abstractNum w:abstractNumId="0" w15:restartNumberingAfterBreak="0">
     <w:nsid w:val="168350B9"/>
     <w:multiLevelType w:val="hybridMultilevel"/>
@@ -1377,7 +1556,7 @@
         <w:rFonts w:hint="default"/>
       </w:rPr>
     </w:lvl>
-    <w:lvl w:ilvl="1" w:tplc="04090019" w:tentative="1">
+    <w:lvl w:ilvl="1" w:tplc="04090019">
       <w:start w:val="1"/>
       <w:numFmt w:val="lowerLetter"/>
       <w:lvlText w:val="%2."/>
@@ -1386,7 +1565,7 @@
         <w:ind w:left="1440" w:hanging="360"/>
       </w:pPr>
     </w:lvl>
-    <w:lvl w:ilvl="2" w:tplc="0409001B" w:tentative="1">
+    <w:lvl w:ilvl="2" w:tplc="0409001B">
       <w:start w:val="1"/>
       <w:numFmt w:val="lowerRoman"/>
       <w:lvlText w:val="%3."/>
@@ -1729,7 +1908,7 @@
 </file>
 
 <file path=word/styles.xml><?xml version="1.0" encoding="utf-8"?>
-<w:styles xmlns:mc="http://schemas.openxmlformats.org/markup-compatibility/2006" xmlns:r="http://schemas.openxmlformats.org/officeDocument/2006/relationships" xmlns:w="http://schemas.openxmlformats.org/wordprocessingml/2006/main" xmlns:w14="http://schemas.microsoft.com/office/word/2010/wordml" xmlns:w15="http://schemas.microsoft.com/office/word/2012/wordml" xmlns:w16cex="http://schemas.microsoft.com/office/word/2018/wordml/cex" xmlns:w16cid="http://schemas.microsoft.com/office/word/2016/wordml/cid" xmlns:w16="http://schemas.microsoft.com/office/word/2018/wordml" xmlns:w16du="http://schemas.microsoft.com/office/word/2023/wordml/word16du" xmlns:w16sdtdh="http://schemas.microsoft.com/office/word/2020/wordml/sdtdatahash" xmlns:w16sdtfl="http://schemas.microsoft.com/office/word/2024/wordml/sdtformatlock" xmlns:w16se="http://schemas.microsoft.com/office/word/2015/wordml/symex" mc:Ignorable="w14 w15 w16se w16cid w16 w16cex w16sdtdh w16sdtfl w16du">
+<w:styles xmlns:mc="http://schemas.openxmlformats.org/markup-compatibility/2006" xmlns:r="http://schemas.openxmlformats.org/officeDocument/2006/relationships" xmlns:w="http://schemas.openxmlformats.org/wordprocessingml/2006/main" xmlns:w14="http://schemas.microsoft.com/office/word/2010/wordml" xmlns:w15="http://schemas.microsoft.com/office/word/2012/wordml" xmlns:w16cex="http://schemas.microsoft.com/office/word/2018/wordml/cex" xmlns:w16cid="http://schemas.microsoft.com/office/word/2016/wordml/cid" xmlns:w16="http://schemas.microsoft.com/office/word/2018/wordml" xmlns:w16sdtdh="http://schemas.microsoft.com/office/word/2020/wordml/sdtdatahash" xmlns:w16sdtfl="http://schemas.microsoft.com/office/word/2024/wordml/sdtformatlock" xmlns:w16se="http://schemas.microsoft.com/office/word/2015/wordml/symex" xmlns:w16du="http://schemas.microsoft.com/office/word/2023/wordml/word16du" mc:Ignorable="w14 w15 w16se w16cid w16 w16cex w16sdtdh w16sdtfl w16du">
   <w:docDefaults>
     <w:rPrDefault>
       <w:rPr>

</xml_diff>

<commit_message>
added pdf for homework 2
</commit_message>
<xml_diff>
--- a/Homework/CSC349 Homework 2 Graphs.docx
+++ b/Homework/CSC349 Homework 2 Graphs.docx
@@ -23,10 +23,7 @@
         <w:t>Directions:</w:t>
       </w:r>
       <w:r>
-        <w:t xml:space="preserve"> Some of the questions on this assignment will appear on the quiz on Wednesday, October 20th.</w:t>
-      </w:r>
-      <w:r>
-        <w:t xml:space="preserve"> For </w:t>
+        <w:t xml:space="preserve"> Some of the questions on this assignment will appear on the quiz on Wednesday, October 20th. For </w:t>
       </w:r>
     </w:p>
     <w:p>
@@ -145,23 +142,7 @@
         </w:numPr>
       </w:pPr>
       <w:r>
-        <w:t>Extend the DFS-Explore(</w:t>
-      </w:r>
-      <w:proofErr w:type="spellStart"/>
-      <w:proofErr w:type="gramStart"/>
-      <w:r>
-        <w:t>G,v</w:t>
-      </w:r>
-      <w:proofErr w:type="spellEnd"/>
-      <w:proofErr w:type="gramEnd"/>
-      <w:r>
-        <w:t>) and DFS(G) algorithms so th</w:t>
-      </w:r>
-      <w:r>
-        <w:t>at, after running DFS(G) on an undirected graph, the following queries are supported</w:t>
-      </w:r>
-      <w:r>
-        <w:t>:</w:t>
+        <w:t>Extend the DFS-Explore(G,v) and DFS(G) algorithms so that, after running DFS(G) on an undirected graph, the following queries are supported:</w:t>
       </w:r>
     </w:p>
     <w:p>
@@ -209,10 +190,7 @@
         </w:numPr>
       </w:pPr>
       <w:r>
-        <w:t>Querying the</w:t>
-      </w:r>
-      <w:r>
-        <w:t xml:space="preserve"> pre- and post-visit number of each vertex</w:t>
+        <w:t>Querying the pre- and post-visit number of each vertex</w:t>
       </w:r>
     </w:p>
     <w:p>
@@ -224,17 +202,7 @@
         </w:numPr>
       </w:pPr>
       <w:r>
-        <w:t>Querying the type of any given edge (</w:t>
-      </w:r>
-      <w:proofErr w:type="spellStart"/>
-      <w:proofErr w:type="gramStart"/>
-      <w:r>
-        <w:t>u,v</w:t>
-      </w:r>
-      <w:proofErr w:type="spellEnd"/>
-      <w:proofErr w:type="gramEnd"/>
-      <w:r>
-        <w:t>)</w:t>
+        <w:t>Querying the type of any given edge (u,v)</w:t>
       </w:r>
     </w:p>
     <w:p>
@@ -246,17 +214,7 @@
         </w:numPr>
       </w:pPr>
       <w:r>
-        <w:t>Given a back edge (</w:t>
-      </w:r>
-      <w:proofErr w:type="spellStart"/>
-      <w:proofErr w:type="gramStart"/>
-      <w:r>
-        <w:t>u,v</w:t>
-      </w:r>
-      <w:proofErr w:type="spellEnd"/>
-      <w:proofErr w:type="gramEnd"/>
-      <w:r>
-        <w:t>), print the corresponding loop</w:t>
+        <w:t>Given a back edge (u,v), print the corresponding loop</w:t>
       </w:r>
     </w:p>
     <w:p>
@@ -280,31 +238,7 @@
         </w:numPr>
       </w:pPr>
       <w:r>
-        <w:t xml:space="preserve">Perform the DFS algorithm on the following graph. Give the pre- and </w:t>
-      </w:r>
-      <w:r>
-        <w:t>post-order</w:t>
-      </w:r>
-      <w:r>
-        <w:t xml:space="preserve"> numbers for each vertex.</w:t>
-      </w:r>
-      <w:r>
-        <w:t xml:space="preserve"> Characterize each edge as a tree edge or back edge.</w:t>
-      </w:r>
-      <w:r>
-        <w:t xml:space="preserve"> </w:t>
-      </w:r>
-      <w:r>
-        <w:t>For consistency, break ties alphabetically.</w:t>
-      </w:r>
-    </w:p>
-    <w:p>
-      <w:pPr>
-        <w:pStyle w:val="Heading3"/>
-        <w:ind w:left="720"/>
-      </w:pPr>
-      <w:r>
-        <w:t>You may alternatively request an adjacency list from the instructor.</w:t>
+        <w:t>Perform the DFS algorithm on the following graph. Give the pre- and post-order numbers for each vertex. Characterize each edge as a tree edge or back edge. For consistency, break ties alphabetically.You may alternatively request an adjacency list from the instructor</w:t>
       </w:r>
     </w:p>
     <w:p>
@@ -319,7 +253,7 @@
         </w:rPr>
         <w:lastRenderedPageBreak/>
         <w:drawing>
-          <wp:inline distT="0" distB="0" distL="0" distR="0" wp14:anchorId="136D5927" wp14:editId="64FEFB68">
+          <wp:inline distT="0" distB="0" distL="0" distR="0" wp14:anchorId="1FE1CB3F" wp14:editId="343EE2C4">
             <wp:extent cx="3619500" cy="1990966"/>
             <wp:effectExtent l="0" t="0" r="0" b="3175"/>
             <wp:docPr id="1" name="Q1 DFS graph" descr="A graph with vertices labeled A through O. Vertices A through J form one connected component, vertices K through O form another."/>
@@ -365,14 +299,27 @@
       <w:r>
         <w:t xml:space="preserve">Figure </w:t>
       </w:r>
-      <w:fldSimple w:instr=" SEQ Figure \* ARABIC ">
-        <w:r>
-          <w:rPr>
-            <w:noProof/>
-          </w:rPr>
-          <w:t>1</w:t>
-        </w:r>
-      </w:fldSimple>
+      <w:r>
+        <w:fldChar w:fldCharType="begin"/>
+      </w:r>
+      <w:r>
+        <w:instrText xml:space="preserve"> SEQ Figure \* ARABIC </w:instrText>
+      </w:r>
+      <w:r>
+        <w:fldChar w:fldCharType="separate"/>
+      </w:r>
+      <w:r>
+        <w:rPr>
+          <w:noProof/>
+        </w:rPr>
+        <w:t>1</w:t>
+      </w:r>
+      <w:r>
+        <w:rPr>
+          <w:noProof/>
+        </w:rPr>
+        <w:fldChar w:fldCharType="end"/>
+      </w:r>
       <w:r>
         <w:t xml:space="preserve"> - Graph for question 1</w:t>
       </w:r>
@@ -380,17 +327,25 @@
     <w:p>
       <w:pPr>
         <w:pStyle w:val="Heading3"/>
-      </w:pPr>
-      <w:r>
-        <w:t>2. Describe how to determine if a back edge in an undirected graph creates an odd length cycle using only pre and post order numbers for each vertex.</w:t>
-      </w:r>
-    </w:p>
-    <w:p>
-      <w:pPr>
-        <w:pStyle w:val="Heading3"/>
-      </w:pPr>
-      <w:r>
-        <w:t xml:space="preserve">3. A </w:t>
+        <w:numPr>
+          <w:ilvl w:val="0"/>
+          <w:numId w:val="3"/>
+        </w:numPr>
+      </w:pPr>
+      <w:r>
+        <w:t>Describe how to determine if a back edge in an undirected graph creates an odd length cycle using only pre and post order numbers for each vertex</w:t>
+      </w:r>
+    </w:p>
+    <w:p>
+      <w:pPr>
+        <w:pStyle w:val="Heading3"/>
+        <w:numPr>
+          <w:ilvl w:val="0"/>
+          <w:numId w:val="3"/>
+        </w:numPr>
+      </w:pPr>
+      <w:r>
+        <w:t xml:space="preserve">A </w:t>
       </w:r>
       <w:r>
         <w:rPr>
@@ -436,42 +391,136 @@
         <w:t>V₁ ∩ V₂ = ∅</w:t>
       </w:r>
       <w:r>
-        <w:t>) such that there are no edges between vertices in the same set.</w:t>
-      </w:r>
-      <w:r>
-        <w:t xml:space="preserve"> Equivalently: vertices can be colored “red” and “blue” such that no two vertices of the same color share an edge.</w:t>
-      </w:r>
-    </w:p>
-    <w:p>
-      <w:pPr>
-        <w:spacing w:after="60"/>
-      </w:pPr>
-    </w:p>
-    <w:p>
-      <w:pPr>
-        <w:spacing w:before="60" w:after="100"/>
-        <w:ind w:left="360"/>
-      </w:pPr>
-      <w:r>
-        <w:t>(a)  Design and analyze an algorithm that determines whether an undirected graph is bipartite.</w:t>
-      </w:r>
-    </w:p>
-    <w:p>
-      <w:pPr>
-        <w:spacing w:after="60"/>
-      </w:pPr>
-    </w:p>
-    <w:p>
-      <w:pPr>
-        <w:spacing w:before="60" w:after="100"/>
-        <w:ind w:left="360"/>
-      </w:pPr>
-      <w:r>
-        <w:t>(b)  Prove the following theorem:</w:t>
-      </w:r>
-    </w:p>
-    <w:p>
-      <w:pPr>
+        <w:t>) such that there are no edges between vertices in the same set. Equivalently: vertices can be colored “red” and “blue” such that no two vertices of the same color share an edge.</w:t>
+      </w:r>
+    </w:p>
+    <w:p>
+      <w:pPr>
+        <w:pStyle w:val="Heading3"/>
+        <w:numPr>
+          <w:ilvl w:val="1"/>
+          <w:numId w:val="3"/>
+        </w:numPr>
+      </w:pPr>
+      <w:r>
+        <w:t>Design and analyze an algorithm that determines whether an undirected graph is bipartite.</w:t>
+      </w:r>
+    </w:p>
+    <w:p>
+      <w:pPr>
+        <w:pStyle w:val="Heading3"/>
+        <w:numPr>
+          <w:ilvl w:val="1"/>
+          <w:numId w:val="3"/>
+        </w:numPr>
+      </w:pPr>
+      <w:r>
+        <w:t xml:space="preserve">Prove the following theorem:  </w:t>
+      </w:r>
+      <w:r>
+        <w:rPr>
+          <w:i/>
+          <w:iCs/>
+        </w:rPr>
+        <w:t>An undirected graph, G, is bipartite if and only if it contains no cycles of odd length.</w:t>
+      </w:r>
+    </w:p>
+    <w:p>
+      <w:pPr>
+        <w:pStyle w:val="Heading3"/>
+        <w:numPr>
+          <w:ilvl w:val="0"/>
+          <w:numId w:val="3"/>
+        </w:numPr>
+      </w:pPr>
+      <w:r>
+        <w:t>There are three containers: a 10-liter container, a 7-liter container, and a 4-liter container. The 7- and 4-liter containers are initially full of water, while the 10-liter container is empty. There is only one operation: pour the contents of one container into the other stopping only when the pouring container is empty or the receiving container is full.</w:t>
+      </w:r>
+    </w:p>
+    <w:p>
+      <w:pPr>
+        <w:pStyle w:val="Heading3"/>
+        <w:numPr>
+          <w:ilvl w:val="1"/>
+          <w:numId w:val="3"/>
+        </w:numPr>
+      </w:pPr>
+      <w:r>
+        <w:t>Is there a sequence of pourings that leaves exactly 2 liters in the 4-liter container?</w:t>
+      </w:r>
+    </w:p>
+    <w:p>
+      <w:pPr>
+        <w:pStyle w:val="Heading3"/>
+        <w:numPr>
+          <w:ilvl w:val="1"/>
+          <w:numId w:val="3"/>
+        </w:numPr>
+      </w:pPr>
+      <w:r>
+        <w:t>Model this as a graph problem:</w:t>
+      </w:r>
+    </w:p>
+    <w:p>
+      <w:pPr>
+        <w:pStyle w:val="Heading3"/>
+        <w:numPr>
+          <w:ilvl w:val="2"/>
+          <w:numId w:val="3"/>
+        </w:numPr>
+      </w:pPr>
+      <w:r>
+        <w:t>Define the graph (What do vertices correspond to? What do edges correspond to?).</w:t>
+      </w:r>
+    </w:p>
+    <w:p>
+      <w:pPr>
+        <w:pStyle w:val="Heading3"/>
+        <w:numPr>
+          <w:ilvl w:val="2"/>
+          <w:numId w:val="3"/>
+        </w:numPr>
+      </w:pPr>
+      <w:r>
+        <w:t>What is the problem that needs to be solved?</w:t>
+      </w:r>
+    </w:p>
+    <w:p>
+      <w:pPr>
+        <w:pStyle w:val="Heading3"/>
+        <w:numPr>
+          <w:ilvl w:val="2"/>
+          <w:numId w:val="3"/>
+        </w:numPr>
+      </w:pPr>
+      <w:r>
+        <w:t>What algorithm can be used to solve this problem?</w:t>
+      </w:r>
+    </w:p>
+    <w:p>
+      <w:pPr>
+        <w:pStyle w:val="Heading3"/>
+        <w:numPr>
+          <w:ilvl w:val="0"/>
+          <w:numId w:val="3"/>
+        </w:numPr>
+      </w:pPr>
+      <w:r>
+        <w:t xml:space="preserve"> Suppose you had a tree with 14 vertices, </w:t>
+      </w:r>
+      <w:r>
+        <w:rPr>
+          <w:rFonts w:ascii="Cambria Math" w:eastAsia="Cambria Math" w:hAnsi="Cambria Math" w:cs="Cambria Math"/>
+        </w:rPr>
+        <w:t>A, B, …, N</w:t>
+      </w:r>
+      <w:r>
+        <w:t xml:space="preserve">. You wrote down the pre and post orderings for the vertices:Then you lost your graph. </w:t>
+      </w:r>
+    </w:p>
+    <w:p>
+      <w:pPr>
+        <w:pStyle w:val="ListParagraph"/>
         <w:spacing w:before="60" w:after="100"/>
         <w:ind w:left="720"/>
       </w:pPr>
@@ -480,296 +529,143 @@
           <w:i/>
           <w:iCs/>
         </w:rPr>
-        <w:t>An undirected graph, G, is bipartite if and only if it contains no cycles of odd length.</w:t>
-      </w:r>
-    </w:p>
-    <w:p>
-      <w:pPr>
-        <w:pStyle w:val="Heading3"/>
-      </w:pPr>
-      <w:r>
-        <w:t xml:space="preserve">4. There are three containers: a </w:t>
-      </w:r>
-      <w:r>
-        <w:t>10-liter</w:t>
-      </w:r>
-      <w:r>
-        <w:t xml:space="preserve"> container, a </w:t>
-      </w:r>
-      <w:r>
-        <w:t>7-liter</w:t>
-      </w:r>
-      <w:r>
-        <w:t xml:space="preserve"> container, and a </w:t>
-      </w:r>
-      <w:r>
-        <w:t>4-liter</w:t>
-      </w:r>
-      <w:r>
-        <w:t xml:space="preserve"> container. The </w:t>
-      </w:r>
-      <w:r>
-        <w:t>7- and 4-liter</w:t>
-      </w:r>
-      <w:r>
-        <w:t xml:space="preserve"> containers are initially full of water, while the 10</w:t>
-      </w:r>
-      <w:r>
-        <w:t>-</w:t>
-      </w:r>
-      <w:r>
-        <w:t>liter container is empty. There is only one operation: pour the contents of one container into the other stopping only when the pouring container is empty or the receiving container is full.</w:t>
+        <w:t>Preorder:</w:t>
+      </w:r>
+      <w:r>
+        <w:t xml:space="preserve">  A, B, D, E, H, L, M, I, F, C, G, J, K, N</w:t>
       </w:r>
     </w:p>
     <w:p>
       <w:pPr>
         <w:pStyle w:val="ListParagraph"/>
-        <w:numPr>
-          <w:ilvl w:val="0"/>
-          <w:numId w:val="2"/>
-        </w:numPr>
-        <w:spacing w:before="60" w:after="80"/>
-      </w:pPr>
-      <w:r>
-        <w:t xml:space="preserve">Is there a sequence of pourings that leaves exactly 2 liters in the </w:t>
-      </w:r>
-      <w:r>
-        <w:t>4-liter</w:t>
-      </w:r>
-      <w:r>
-        <w:t xml:space="preserve"> container?</w:t>
-      </w:r>
-    </w:p>
-    <w:p>
-      <w:pPr>
-        <w:pStyle w:val="ListParagraph"/>
-        <w:numPr>
-          <w:ilvl w:val="0"/>
-          <w:numId w:val="2"/>
-        </w:numPr>
-        <w:spacing w:before="60" w:after="80"/>
-      </w:pPr>
-      <w:r>
-        <w:t>Model this as a graph problem:</w:t>
-      </w:r>
-    </w:p>
-    <w:p>
-      <w:pPr>
-        <w:pStyle w:val="ListParagraph"/>
-        <w:numPr>
-          <w:ilvl w:val="1"/>
-          <w:numId w:val="2"/>
-        </w:numPr>
-        <w:spacing w:before="60" w:after="80"/>
-      </w:pPr>
-      <w:r>
-        <w:t>Define the graph</w:t>
-      </w:r>
-      <w:r>
-        <w:t xml:space="preserve"> (What do vertices correspond to? What do edges correspond to?)</w:t>
-      </w:r>
-      <w:r>
-        <w:t>.</w:t>
-      </w:r>
-    </w:p>
-    <w:p>
-      <w:pPr>
-        <w:pStyle w:val="ListParagraph"/>
-        <w:numPr>
-          <w:ilvl w:val="1"/>
-          <w:numId w:val="2"/>
-        </w:numPr>
-        <w:spacing w:before="60" w:after="80"/>
-      </w:pPr>
-      <w:r>
-        <w:t>What is the problem that needs to be solved?</w:t>
-      </w:r>
-    </w:p>
-    <w:p>
-      <w:pPr>
-        <w:pStyle w:val="ListParagraph"/>
-        <w:numPr>
-          <w:ilvl w:val="1"/>
-          <w:numId w:val="2"/>
-        </w:numPr>
-        <w:spacing w:before="60" w:after="80"/>
-      </w:pPr>
-      <w:r>
-        <w:t>What algorithm can be used to solve this problem?</w:t>
-      </w:r>
-    </w:p>
-    <w:p>
-      <w:pPr>
-        <w:pStyle w:val="Heading3"/>
-      </w:pPr>
-      <w:r>
-        <w:t xml:space="preserve">5. Suppose you had a tree with 14 vertices, </w:t>
-      </w:r>
-      <w:r>
-        <w:rPr>
-          <w:rFonts w:ascii="Cambria Math" w:eastAsia="Cambria Math" w:hAnsi="Cambria Math" w:cs="Cambria Math"/>
-        </w:rPr>
-        <w:t>A, B, …, N</w:t>
-      </w:r>
-      <w:r>
-        <w:t>. You wrote down the pre and post orderings for the vertices:</w:t>
-      </w:r>
-    </w:p>
-    <w:p>
-      <w:pPr>
-        <w:spacing w:after="60"/>
-      </w:pPr>
-    </w:p>
-    <w:p>
-      <w:pPr>
         <w:spacing w:before="60" w:after="100"/>
-        <w:ind w:left="360"/>
+        <w:ind w:left="720"/>
       </w:pPr>
       <w:r>
         <w:rPr>
           <w:i/>
           <w:iCs/>
         </w:rPr>
-        <w:t>Preorder:</w:t>
-      </w:r>
-      <w:r>
-        <w:t xml:space="preserve">  A, B, D, E, H, L, M, I, F, C, G, J, K, N</w:t>
-      </w:r>
-    </w:p>
-    <w:p>
-      <w:pPr>
-        <w:spacing w:before="60" w:after="100"/>
-        <w:ind w:left="360"/>
-      </w:pPr>
+        <w:t>Post order:</w:t>
+      </w:r>
+      <w:r>
+        <w:t xml:space="preserve">  D, L, M, H, I, E, F, B, J, N, K, G, C, A</w:t>
+      </w:r>
+    </w:p>
+    <w:p>
+      <w:pPr>
+        <w:pStyle w:val="Heading3"/>
+        <w:ind w:left="720"/>
+      </w:pPr>
+      <w:r>
+        <w:t>Can you reconstruct the tree? If so, do.</w:t>
+      </w:r>
+    </w:p>
+    <w:p>
+      <w:pPr>
+        <w:pStyle w:val="Heading3"/>
+        <w:numPr>
+          <w:ilvl w:val="0"/>
+          <w:numId w:val="3"/>
+        </w:numPr>
+      </w:pPr>
+      <w:r>
+        <w:t xml:space="preserve">Design and analyze an algorithm which takes as an input an undirected graph, </w:t>
+      </w:r>
+      <w:r>
+        <w:rPr>
+          <w:rFonts w:ascii="Cambria Math" w:eastAsia="Cambria Math" w:hAnsi="Cambria Math" w:cs="Cambria Math"/>
+        </w:rPr>
+        <w:t>G</w:t>
+      </w:r>
+      <w:r>
+        <w:t xml:space="preserve">, and an edge, </w:t>
+      </w:r>
+      <w:r>
+        <w:rPr>
+          <w:rFonts w:ascii="Cambria Math" w:eastAsia="Cambria Math" w:hAnsi="Cambria Math" w:cs="Cambria Math"/>
+        </w:rPr>
+        <w:t>e = (u, v)</w:t>
+      </w:r>
+      <w:r>
+        <w:t xml:space="preserve">, and determines whether </w:t>
+      </w:r>
+      <w:r>
+        <w:rPr>
+          <w:rFonts w:ascii="Cambria Math" w:eastAsia="Cambria Math" w:hAnsi="Cambria Math" w:cs="Cambria Math"/>
+        </w:rPr>
+        <w:t>G</w:t>
+      </w:r>
+      <w:r>
+        <w:t xml:space="preserve"> has a cycle containing </w:t>
+      </w:r>
+      <w:r>
+        <w:rPr>
+          <w:rFonts w:ascii="Cambria Math" w:eastAsia="Cambria Math" w:hAnsi="Cambria Math" w:cs="Cambria Math"/>
+        </w:rPr>
+        <w:t>e</w:t>
+      </w:r>
+      <w:r>
+        <w:t>.</w:t>
+      </w:r>
+    </w:p>
+    <w:p>
+      <w:pPr>
+        <w:pStyle w:val="Heading3"/>
+        <w:numPr>
+          <w:ilvl w:val="0"/>
+          <w:numId w:val="3"/>
+        </w:numPr>
+      </w:pPr>
+      <w:r>
+        <w:lastRenderedPageBreak/>
+        <w:t>Prove that in an undirected graph, Σ</w:t>
+      </w:r>
+      <w:r>
+        <w:rPr>
+          <w:vertAlign w:val="subscript"/>
+        </w:rPr>
+        <w:t>u∈V</w:t>
+      </w:r>
+      <w:r>
+        <w:rPr>
+          <w:rFonts w:ascii="Cambria Math" w:eastAsia="Cambria Math" w:hAnsi="Cambria Math" w:cs="Cambria Math"/>
+        </w:rPr>
+        <w:t xml:space="preserve"> degree(u) = 2|E|</w:t>
+      </w:r>
+      <w:r>
+        <w:t>. Conclude that there must be an even number of vertices with odd degree. Does a similar statement hold for the number of vertices of odd indegree in a directed graph?</w:t>
+      </w:r>
+    </w:p>
+    <w:p>
+      <w:pPr>
+        <w:pStyle w:val="Heading3"/>
+        <w:numPr>
+          <w:ilvl w:val="0"/>
+          <w:numId w:val="3"/>
+        </w:numPr>
+      </w:pPr>
+      <w:r>
+        <w:t>Prove the following theorem:</w:t>
+      </w:r>
       <w:r>
         <w:rPr>
           <w:i/>
           <w:iCs/>
         </w:rPr>
-        <w:t>Post order:</w:t>
-      </w:r>
-      <w:r>
-        <w:t xml:space="preserve">  D, L, M, H, I, E, F, B, J, N, K, G, C, A</w:t>
-      </w:r>
-    </w:p>
-    <w:p>
-      <w:pPr>
-        <w:spacing w:after="60"/>
-      </w:pPr>
-    </w:p>
-    <w:p>
-      <w:pPr>
-        <w:spacing w:before="60" w:after="100"/>
-      </w:pPr>
-      <w:r>
-        <w:t>Then you lost your graph. Can you reconstruct the tree? If so, do.</w:t>
-      </w:r>
-    </w:p>
-    <w:p>
-      <w:pPr>
-        <w:pStyle w:val="Heading3"/>
-      </w:pPr>
-      <w:r>
-        <w:t xml:space="preserve">6. Design and analyze an algorithm which takes as an input an undirected graph, </w:t>
-      </w:r>
-      <w:r>
-        <w:rPr>
-          <w:rFonts w:ascii="Cambria Math" w:eastAsia="Cambria Math" w:hAnsi="Cambria Math" w:cs="Cambria Math"/>
-        </w:rPr>
-        <w:t>G</w:t>
-      </w:r>
-      <w:r>
-        <w:t xml:space="preserve">, and an edge, </w:t>
-      </w:r>
-      <w:r>
-        <w:rPr>
-          <w:rFonts w:ascii="Cambria Math" w:eastAsia="Cambria Math" w:hAnsi="Cambria Math" w:cs="Cambria Math"/>
-        </w:rPr>
-        <w:t>e = (u, v)</w:t>
-      </w:r>
-      <w:r>
-        <w:t xml:space="preserve">, and determines whether </w:t>
-      </w:r>
-      <w:r>
-        <w:rPr>
-          <w:rFonts w:ascii="Cambria Math" w:eastAsia="Cambria Math" w:hAnsi="Cambria Math" w:cs="Cambria Math"/>
-        </w:rPr>
-        <w:t>G</w:t>
-      </w:r>
-      <w:r>
-        <w:t xml:space="preserve"> has a cycle containing </w:t>
-      </w:r>
-      <w:r>
-        <w:rPr>
-          <w:rFonts w:ascii="Cambria Math" w:eastAsia="Cambria Math" w:hAnsi="Cambria Math" w:cs="Cambria Math"/>
-        </w:rPr>
-        <w:t>e</w:t>
-      </w:r>
-      <w:r>
-        <w:t>.</w:t>
-      </w:r>
-    </w:p>
-    <w:p>
-      <w:pPr>
-        <w:pStyle w:val="Heading3"/>
-      </w:pPr>
-      <w:r>
-        <w:lastRenderedPageBreak/>
-        <w:t xml:space="preserve">7. Prove that in an undirected graph, </w:t>
-      </w:r>
-      <w:proofErr w:type="spellStart"/>
-      <w:r>
-        <w:t>Σ</w:t>
-      </w:r>
-      <w:r>
-        <w:rPr>
-          <w:vertAlign w:val="subscript"/>
-        </w:rPr>
-        <w:t>u∈V</w:t>
-      </w:r>
-      <w:proofErr w:type="spellEnd"/>
-      <w:r>
-        <w:rPr>
-          <w:rFonts w:ascii="Cambria Math" w:eastAsia="Cambria Math" w:hAnsi="Cambria Math" w:cs="Cambria Math"/>
-        </w:rPr>
-        <w:t xml:space="preserve"> degree(u) = 2|E|</w:t>
-      </w:r>
-      <w:r>
-        <w:t>. Conclude that there must be an even number of vertices with odd degree. Does a similar statement hold for the number of vertices of odd indegree in a directed graph?</w:t>
-      </w:r>
-    </w:p>
-    <w:p>
-      <w:pPr>
-        <w:pStyle w:val="Heading3"/>
-      </w:pPr>
-      <w:r>
-        <w:t>8. Prove the following theorem:</w:t>
-      </w:r>
-    </w:p>
-    <w:p>
-      <w:pPr>
-        <w:spacing w:after="60"/>
-      </w:pPr>
-    </w:p>
-    <w:p>
-      <w:pPr>
-        <w:spacing w:before="60" w:after="100"/>
-        <w:ind w:left="360"/>
-      </w:pPr>
-      <w:r>
-        <w:rPr>
-          <w:i/>
-          <w:iCs/>
-        </w:rPr>
-        <w:t>In any connected undirected graph, there is a vertex whose removal leaves the graph connected.</w:t>
-      </w:r>
-    </w:p>
-    <w:p>
-      <w:pPr>
-        <w:pStyle w:val="Heading3"/>
-      </w:pPr>
-      <w:r>
-        <w:t>9. Perform the DFS algorithm on the following directed graph. Assign pre- and post-visit numbers to each vertex and label each edge as a tree edge, forward edge, back edge or cross edge. For consistency, break ties alphabetically.</w:t>
+        <w:t>In any connected undirected graph, there is a vertex whose removal leaves the graph connected</w:t>
+      </w:r>
+    </w:p>
+    <w:p>
+      <w:pPr>
+        <w:pStyle w:val="Heading3"/>
+        <w:numPr>
+          <w:ilvl w:val="0"/>
+          <w:numId w:val="3"/>
+        </w:numPr>
+      </w:pPr>
+      <w:r>
+        <w:t>Perform the DFS algorithm on the following directed graph. Assign pre- and post-visit numbers to each vertex and label each edge as a tree edge, forward edge, back edge or cross edge. For consistency, break ties alphabetically.</w:t>
       </w:r>
     </w:p>
     <w:p>
@@ -791,7 +687,7 @@
           <w:noProof/>
         </w:rPr>
         <w:drawing>
-          <wp:inline distT="0" distB="0" distL="0" distR="0" wp14:anchorId="17F695DF" wp14:editId="781D3116">
+          <wp:inline distT="0" distB="0" distL="0" distR="0" wp14:anchorId="6B8E397D" wp14:editId="4A406AC5">
             <wp:extent cx="3098653" cy="2000250"/>
             <wp:effectExtent l="0" t="0" r="635" b="0"/>
             <wp:docPr id="237561446" name="Q9 directed DFS graph" descr="A directed graph with vertices labeled A through L"/>
@@ -837,14 +733,27 @@
       <w:r>
         <w:t xml:space="preserve">Figure </w:t>
       </w:r>
-      <w:fldSimple w:instr=" SEQ Figure \* ARABIC ">
-        <w:r>
-          <w:rPr>
-            <w:noProof/>
-          </w:rPr>
-          <w:t>2</w:t>
-        </w:r>
-      </w:fldSimple>
+      <w:r>
+        <w:fldChar w:fldCharType="begin"/>
+      </w:r>
+      <w:r>
+        <w:instrText xml:space="preserve"> SEQ Figure \* ARABIC </w:instrText>
+      </w:r>
+      <w:r>
+        <w:fldChar w:fldCharType="separate"/>
+      </w:r>
+      <w:r>
+        <w:rPr>
+          <w:noProof/>
+        </w:rPr>
+        <w:t>2</w:t>
+      </w:r>
+      <w:r>
+        <w:rPr>
+          <w:noProof/>
+        </w:rPr>
+        <w:fldChar w:fldCharType="end"/>
+      </w:r>
       <w:r>
         <w:t xml:space="preserve"> - Graph for problem 9</w:t>
       </w:r>
@@ -852,17 +761,25 @@
     <w:p>
       <w:pPr>
         <w:pStyle w:val="Heading3"/>
-      </w:pPr>
-      <w:r>
-        <w:t>10. Design and analyze an algorithm for finding an odd length cycle in a strongly connected directed graph.</w:t>
-      </w:r>
-    </w:p>
-    <w:p>
-      <w:pPr>
-        <w:pStyle w:val="Heading3"/>
-      </w:pPr>
-      <w:r>
-        <w:t>11. Is it always possible to make an undirected graph with two connected components connected by adding a single edge?</w:t>
+        <w:numPr>
+          <w:ilvl w:val="0"/>
+          <w:numId w:val="3"/>
+        </w:numPr>
+      </w:pPr>
+      <w:r>
+        <w:t>Design and analyze an algorithm for finding an odd length cycle in a strongly connected directed graph.</w:t>
+      </w:r>
+    </w:p>
+    <w:p>
+      <w:pPr>
+        <w:pStyle w:val="Heading3"/>
+        <w:numPr>
+          <w:ilvl w:val="0"/>
+          <w:numId w:val="3"/>
+        </w:numPr>
+      </w:pPr>
+      <w:r>
+        <w:t>Is it always possible to make an undirected graph with two connected components connected by adding a single edge?</w:t>
       </w:r>
     </w:p>
     <w:p>
@@ -893,10 +810,22 @@
     </w:p>
     <w:p>
       <w:pPr>
-        <w:pStyle w:val="Heading3"/>
-      </w:pPr>
-      <w:r>
-        <w:t xml:space="preserve">12. Give an example of a strongly connected directed graph </w:t>
+        <w:pStyle w:val="ListParagraph"/>
+        <w:spacing w:before="60" w:after="80"/>
+        <w:ind w:left="720"/>
+      </w:pPr>
+    </w:p>
+    <w:p>
+      <w:pPr>
+        <w:pStyle w:val="ListParagraph"/>
+        <w:numPr>
+          <w:ilvl w:val="0"/>
+          <w:numId w:val="3"/>
+        </w:numPr>
+        <w:spacing w:before="60" w:after="80"/>
+      </w:pPr>
+      <w:r>
+        <w:t xml:space="preserve">Give an example of a strongly connected directed graph </w:t>
       </w:r>
       <w:r>
         <w:rPr>
@@ -937,10 +866,15 @@
     </w:p>
     <w:p>
       <w:pPr>
-        <w:pStyle w:val="Heading3"/>
-      </w:pPr>
-      <w:r>
-        <w:t xml:space="preserve">13. True or False? (Proof or counterexample) If a depth-first search on a directed graph </w:t>
+        <w:pStyle w:val="ListParagraph"/>
+        <w:numPr>
+          <w:ilvl w:val="0"/>
+          <w:numId w:val="3"/>
+        </w:numPr>
+        <w:spacing w:before="60" w:after="80"/>
+      </w:pPr>
+      <w:r>
+        <w:t xml:space="preserve">True or False? (Proof or counterexample) If a depth-first search on a directed graph </w:t>
       </w:r>
       <w:r>
         <w:rPr>
@@ -981,10 +915,15 @@
     </w:p>
     <w:p>
       <w:pPr>
-        <w:pStyle w:val="Heading3"/>
-      </w:pPr>
-      <w:r>
-        <w:t xml:space="preserve">14. True or False? (Proof or counterexample) If a directed graph </w:t>
+        <w:pStyle w:val="ListParagraph"/>
+        <w:numPr>
+          <w:ilvl w:val="0"/>
+          <w:numId w:val="3"/>
+        </w:numPr>
+        <w:spacing w:before="60" w:after="80"/>
+      </w:pPr>
+      <w:r>
+        <w:t xml:space="preserve"> True or False? (Proof or counterexample) If a directed graph </w:t>
       </w:r>
       <w:r>
         <w:rPr>
@@ -1007,18 +946,28 @@
     </w:p>
     <w:p>
       <w:pPr>
-        <w:pStyle w:val="Heading3"/>
-      </w:pPr>
-      <w:r>
-        <w:t>15. Modify the Breadth First Search algorithm to handle directed graphs.</w:t>
-      </w:r>
-    </w:p>
-    <w:p>
-      <w:pPr>
-        <w:pStyle w:val="Heading3"/>
-      </w:pPr>
-      <w:r>
-        <w:t xml:space="preserve">16. Suppose a CS curriculum consists of </w:t>
+        <w:pStyle w:val="ListParagraph"/>
+        <w:numPr>
+          <w:ilvl w:val="0"/>
+          <w:numId w:val="3"/>
+        </w:numPr>
+        <w:spacing w:before="60" w:after="80"/>
+      </w:pPr>
+      <w:r>
+        <w:t>Modify the Breadth First Search algorithm to handle directed graphs.</w:t>
+      </w:r>
+    </w:p>
+    <w:p>
+      <w:pPr>
+        <w:pStyle w:val="ListParagraph"/>
+        <w:numPr>
+          <w:ilvl w:val="0"/>
+          <w:numId w:val="3"/>
+        </w:numPr>
+        <w:spacing w:before="60" w:after="80"/>
+      </w:pPr>
+      <w:r>
+        <w:t xml:space="preserve">Suppose a CS curriculum consists of </w:t>
       </w:r>
       <w:r>
         <w:rPr>
@@ -1072,22 +1021,21 @@
         <w:t>w</w:t>
       </w:r>
       <w:r>
-        <w:t xml:space="preserve">. Design </w:t>
-      </w:r>
+        <w:t>. Design and analyze an algorithm that works directly with this graph representation, and computes the minimum number of quarters necessary to complete the curriculum (assume that a student can take any number of courses in one quarter).</w:t>
+      </w:r>
+    </w:p>
+    <w:p>
+      <w:pPr>
+        <w:pStyle w:val="ListParagraph"/>
+        <w:numPr>
+          <w:ilvl w:val="0"/>
+          <w:numId w:val="3"/>
+        </w:numPr>
+        <w:spacing w:before="60" w:after="80"/>
+      </w:pPr>
       <w:r>
         <w:lastRenderedPageBreak/>
-        <w:t>and analyze an algorithm that works directly with this graph representation, and computes the minimum number of quarters necessary to complete the curriculum (assume that a student can take any number of courses in one quarter).</w:t>
-      </w:r>
-    </w:p>
-    <w:p>
-      <w:pPr>
-        <w:pStyle w:val="Heading3"/>
-      </w:pPr>
-      <w:r>
-        <w:t>17. Suppose you are given a source word and a target word. Your goal is to transform the source word to the target word in as few valid steps as possible. The valid steps are</w:t>
-      </w:r>
-      <w:r>
-        <w:t>:</w:t>
+        <w:t>Suppose you are given a source word and a target word. Your goal is to transform the source word to the target word in as few valid steps as possible. The valid steps are:</w:t>
       </w:r>
     </w:p>
     <w:p>
@@ -1131,13 +1079,7 @@
         <w:pStyle w:val="Heading3"/>
       </w:pPr>
       <w:r>
-        <w:t>After each step, the resulting string must be a valid</w:t>
-      </w:r>
-      <w:r>
-        <w:t xml:space="preserve"> English</w:t>
-      </w:r>
-      <w:r>
-        <w:t xml:space="preserve"> word. For example, we could transform </w:t>
+        <w:t xml:space="preserve">After each step, the resulting string must be a valid English word. For example, we could transform </w:t>
       </w:r>
       <w:r>
         <w:rPr>
@@ -1213,10 +1155,15 @@
     </w:p>
     <w:p>
       <w:pPr>
-        <w:pStyle w:val="Heading3"/>
-      </w:pPr>
-      <w:r>
-        <w:t xml:space="preserve">18. Run Dijkstra’s algorithm on the following graph, starting at vertex </w:t>
+        <w:pStyle w:val="ListParagraph"/>
+        <w:numPr>
+          <w:ilvl w:val="0"/>
+          <w:numId w:val="3"/>
+        </w:numPr>
+        <w:spacing w:before="60" w:after="100"/>
+      </w:pPr>
+      <w:r>
+        <w:t xml:space="preserve">Run Dijkstra’s algorithm on the following graph, starting at vertex </w:t>
       </w:r>
       <w:r>
         <w:rPr>
@@ -1247,7 +1194,7 @@
           <w:noProof/>
         </w:rPr>
         <w:drawing>
-          <wp:inline distT="0" distB="0" distL="0" distR="0" wp14:anchorId="5E4BE969" wp14:editId="3AC1C224">
+          <wp:inline distT="0" distB="0" distL="0" distR="0" wp14:anchorId="244CD2DF" wp14:editId="32427D8B">
             <wp:extent cx="3600931" cy="2095500"/>
             <wp:effectExtent l="0" t="0" r="6350" b="0"/>
             <wp:docPr id="958458452" name="Q18 Dijkstra graph" descr="A weighted, directed graph with vertices labeled A through I"/>
@@ -1293,14 +1240,27 @@
       <w:r>
         <w:t xml:space="preserve">Figure </w:t>
       </w:r>
-      <w:fldSimple w:instr=" SEQ Figure \* ARABIC ">
-        <w:r>
-          <w:rPr>
-            <w:noProof/>
-          </w:rPr>
-          <w:t>3</w:t>
-        </w:r>
-      </w:fldSimple>
+      <w:r>
+        <w:fldChar w:fldCharType="begin"/>
+      </w:r>
+      <w:r>
+        <w:instrText xml:space="preserve"> SEQ Figure \* ARABIC </w:instrText>
+      </w:r>
+      <w:r>
+        <w:fldChar w:fldCharType="separate"/>
+      </w:r>
+      <w:r>
+        <w:rPr>
+          <w:noProof/>
+        </w:rPr>
+        <w:t>3</w:t>
+      </w:r>
+      <w:r>
+        <w:rPr>
+          <w:noProof/>
+        </w:rPr>
+        <w:fldChar w:fldCharType="end"/>
+      </w:r>
       <w:r>
         <w:t xml:space="preserve"> - Graph for problem 18</w:t>
       </w:r>
@@ -1335,12 +1295,30 @@
     </w:p>
     <w:p>
       <w:pPr>
-        <w:pStyle w:val="Heading3"/>
-      </w:pPr>
-      <w:r>
-        <w:t>19. Can Dijkstra’s algorithm handle negative weight edges? Why or why not?</w:t>
-      </w:r>
-    </w:p>
+        <w:spacing w:before="60" w:after="100"/>
+        <w:ind w:left="360"/>
+      </w:pPr>
+    </w:p>
+    <w:p>
+      <w:pPr>
+        <w:spacing w:before="60" w:after="100"/>
+        <w:ind w:left="360"/>
+      </w:pPr>
+    </w:p>
+    <w:p>
+      <w:pPr>
+        <w:pStyle w:val="ListParagraph"/>
+        <w:numPr>
+          <w:ilvl w:val="0"/>
+          <w:numId w:val="3"/>
+        </w:numPr>
+        <w:spacing w:before="60" w:after="100"/>
+      </w:pPr>
+      <w:r>
+        <w:t>Can Dijkstra’s algorithm handle negative weight edges? Why or why not?</w:t>
+      </w:r>
+    </w:p>
+    <w:p/>
     <w:sectPr>
       <w:headerReference w:type="default" r:id="rId10"/>
       <w:footerReference w:type="default" r:id="rId11"/>

</xml_diff>